<commit_message>
docs(ba-kit): hướng dẫn requirement-to-flow — phân định CR/feedback, output CR, setup Claude Code
Co-Authored-By: Claude Opus 5.5 <noreply@anthropic.com>
</commit_message>
<xml_diff>
--- a/ba-kit/requirement-to-flow/Hướng dẫn Flow Hoá Requirement chi tiết.docx
+++ b/ba-kit/requirement-to-flow/Hướng dẫn Flow Hoá Requirement chi tiết.docx
@@ -30,7 +30,7 @@
       </w:pPr>
       <w:sdt>
         <w:sdtPr>
-          <w:id w:val="1582466097"/>
+          <w:id w:val="2111675945"/>
           <w:tag w:val="goog_rdk_0"/>
         </w:sdtPr>
         <w:sdtContent>
@@ -128,7 +128,7 @@
         <w:widowControl w:val="1"/>
         <w:numPr>
           <w:ilvl w:val="0"/>
-          <w:numId w:val="3"/>
+          <w:numId w:val="5"/>
         </w:numPr>
         <w:pBdr>
           <w:top w:space="0" w:sz="0" w:val="nil"/>
@@ -171,7 +171,7 @@
         <w:widowControl w:val="1"/>
         <w:numPr>
           <w:ilvl w:val="0"/>
-          <w:numId w:val="3"/>
+          <w:numId w:val="5"/>
         </w:numPr>
         <w:pBdr>
           <w:top w:space="0" w:sz="0" w:val="nil"/>
@@ -236,12 +236,12 @@
           <wp:inline distB="0" distT="0" distL="0" distR="0">
             <wp:extent cx="4171492" cy="5049700"/>
             <wp:effectExtent b="0" l="0" r="0" t="0"/>
-            <wp:docPr id="1997424750" name="image3.png"/>
+            <wp:docPr id="1997424753" name="image5.png"/>
             <a:graphic>
               <a:graphicData uri="http://schemas.openxmlformats.org/drawingml/2006/picture">
                 <pic:pic>
                   <pic:nvPicPr>
-                    <pic:cNvPr id="0" name="image3.png"/>
+                    <pic:cNvPr id="0" name="image5.png"/>
                     <pic:cNvPicPr preferRelativeResize="0"/>
                   </pic:nvPicPr>
                   <pic:blipFill>
@@ -335,7 +335,7 @@
         <w:widowControl w:val="1"/>
         <w:numPr>
           <w:ilvl w:val="0"/>
-          <w:numId w:val="3"/>
+          <w:numId w:val="5"/>
         </w:numPr>
         <w:pBdr>
           <w:top w:space="0" w:sz="0" w:val="nil"/>
@@ -378,7 +378,7 @@
         <w:widowControl w:val="1"/>
         <w:numPr>
           <w:ilvl w:val="0"/>
-          <w:numId w:val="3"/>
+          <w:numId w:val="5"/>
         </w:numPr>
         <w:pBdr>
           <w:top w:space="0" w:sz="0" w:val="nil"/>
@@ -412,6 +412,11 @@
         </w:rPr>
         <w:t xml:space="preserve">└── requirements/</w:t>
       </w:r>
+      <w:r>
+        <w:rPr>
+          <w:rtl w:val="0"/>
+        </w:rPr>
+      </w:r>
     </w:p>
     <w:p>
       <w:pPr>
@@ -421,7 +426,7 @@
         <w:widowControl w:val="1"/>
         <w:numPr>
           <w:ilvl w:val="0"/>
-          <w:numId w:val="3"/>
+          <w:numId w:val="5"/>
         </w:numPr>
         <w:pBdr>
           <w:top w:space="0" w:sz="0" w:val="nil"/>
@@ -438,7 +443,7 @@
       </w:pPr>
       <w:sdt>
         <w:sdtPr>
-          <w:id w:val="-1512540870"/>
+          <w:id w:val="1151837109"/>
           <w:tag w:val="goog_rdk_1"/>
         </w:sdtPr>
         <w:sdtContent>
@@ -472,7 +477,7 @@
         <w:widowControl w:val="1"/>
         <w:numPr>
           <w:ilvl w:val="0"/>
-          <w:numId w:val="3"/>
+          <w:numId w:val="5"/>
         </w:numPr>
         <w:pBdr>
           <w:top w:space="0" w:sz="0" w:val="nil"/>
@@ -489,7 +494,7 @@
       </w:pPr>
       <w:sdt>
         <w:sdtPr>
-          <w:id w:val="1950882696"/>
+          <w:id w:val="1934787801"/>
           <w:tag w:val="goog_rdk_2"/>
         </w:sdtPr>
         <w:sdtContent>
@@ -523,7 +528,7 @@
         <w:widowControl w:val="1"/>
         <w:numPr>
           <w:ilvl w:val="0"/>
-          <w:numId w:val="3"/>
+          <w:numId w:val="5"/>
         </w:numPr>
         <w:pBdr>
           <w:top w:space="0" w:sz="0" w:val="nil"/>
@@ -540,7 +545,7 @@
       </w:pPr>
       <w:sdt>
         <w:sdtPr>
-          <w:id w:val="-1554586059"/>
+          <w:id w:val="-1195679921"/>
           <w:tag w:val="goog_rdk_3"/>
         </w:sdtPr>
         <w:sdtContent>
@@ -574,7 +579,7 @@
         <w:widowControl w:val="1"/>
         <w:numPr>
           <w:ilvl w:val="0"/>
-          <w:numId w:val="3"/>
+          <w:numId w:val="5"/>
         </w:numPr>
         <w:pBdr>
           <w:top w:space="0" w:sz="0" w:val="nil"/>
@@ -591,7 +596,7 @@
       </w:pPr>
       <w:sdt>
         <w:sdtPr>
-          <w:id w:val="1460802508"/>
+          <w:id w:val="-1501732002"/>
           <w:tag w:val="goog_rdk_4"/>
         </w:sdtPr>
         <w:sdtContent>
@@ -647,12 +652,12 @@
           <wp:inline distB="0" distT="0" distL="0" distR="0">
             <wp:extent cx="3461012" cy="4422404"/>
             <wp:effectExtent b="0" l="0" r="0" t="0"/>
-            <wp:docPr id="1997424752" name="image4.png"/>
+            <wp:docPr id="1997424755" name="image11.png"/>
             <a:graphic>
               <a:graphicData uri="http://schemas.openxmlformats.org/drawingml/2006/picture">
                 <pic:pic>
                   <pic:nvPicPr>
-                    <pic:cNvPr id="0" name="image4.png"/>
+                    <pic:cNvPr id="0" name="image11.png"/>
                     <pic:cNvPicPr preferRelativeResize="0"/>
                   </pic:nvPicPr>
                   <pic:blipFill>
@@ -758,7 +763,7 @@
         <w:widowControl w:val="1"/>
         <w:numPr>
           <w:ilvl w:val="0"/>
-          <w:numId w:val="3"/>
+          <w:numId w:val="5"/>
         </w:numPr>
         <w:pBdr>
           <w:top w:space="0" w:sz="0" w:val="nil"/>
@@ -801,7 +806,7 @@
         <w:widowControl w:val="1"/>
         <w:numPr>
           <w:ilvl w:val="0"/>
-          <w:numId w:val="3"/>
+          <w:numId w:val="5"/>
         </w:numPr>
         <w:pBdr>
           <w:top w:space="0" w:sz="0" w:val="nil"/>
@@ -903,7 +908,7 @@
         <w:widowControl w:val="1"/>
         <w:numPr>
           <w:ilvl w:val="0"/>
-          <w:numId w:val="3"/>
+          <w:numId w:val="5"/>
         </w:numPr>
         <w:pBdr>
           <w:top w:space="0" w:sz="0" w:val="nil"/>
@@ -957,7 +962,7 @@
         <w:widowControl w:val="1"/>
         <w:numPr>
           <w:ilvl w:val="0"/>
-          <w:numId w:val="3"/>
+          <w:numId w:val="5"/>
         </w:numPr>
         <w:pBdr>
           <w:top w:space="0" w:sz="0" w:val="nil"/>
@@ -1016,7 +1021,32 @@
         </w:pBdr>
         <w:shd w:fill="auto" w:val="clear"/>
         <w:spacing w:after="0" w:before="0" w:line="276" w:lineRule="auto"/>
-        <w:ind w:left="360" w:right="0" w:hanging="360"/>
+        <w:ind w:left="0" w:right="0" w:firstLine="0"/>
+        <w:jc w:val="left"/>
+        <w:rPr/>
+      </w:pPr>
+      <w:r>
+        <w:rPr>
+          <w:rtl w:val="0"/>
+        </w:rPr>
+      </w:r>
+    </w:p>
+    <w:p>
+      <w:pPr>
+        <w:keepNext w:val="0"/>
+        <w:keepLines w:val="0"/>
+        <w:pageBreakBefore w:val="0"/>
+        <w:widowControl w:val="1"/>
+        <w:pBdr>
+          <w:top w:space="0" w:sz="0" w:val="nil"/>
+          <w:left w:space="0" w:sz="0" w:val="nil"/>
+          <w:bottom w:space="0" w:sz="0" w:val="nil"/>
+          <w:right w:space="0" w:sz="0" w:val="nil"/>
+          <w:between w:space="0" w:sz="0" w:val="nil"/>
+        </w:pBdr>
+        <w:shd w:fill="auto" w:val="clear"/>
+        <w:spacing w:after="0" w:before="0" w:line="276" w:lineRule="auto"/>
+        <w:ind w:left="0" w:right="0" w:firstLine="0"/>
         <w:jc w:val="left"/>
         <w:rPr>
           <w:rFonts w:ascii="Arial" w:cs="Arial" w:eastAsia="Arial" w:hAnsi="Arial"/>
@@ -1036,53 +1066,6 @@
       </w:pPr>
       <w:r>
         <w:rPr>
-          <w:rtl w:val="0"/>
-        </w:rPr>
-      </w:r>
-    </w:p>
-    <w:p>
-      <w:pPr>
-        <w:keepNext w:val="0"/>
-        <w:keepLines w:val="0"/>
-        <w:pageBreakBefore w:val="0"/>
-        <w:widowControl w:val="1"/>
-        <w:pBdr>
-          <w:top w:space="0" w:sz="0" w:val="nil"/>
-          <w:left w:space="0" w:sz="0" w:val="nil"/>
-          <w:bottom w:space="0" w:sz="0" w:val="nil"/>
-          <w:right w:space="0" w:sz="0" w:val="nil"/>
-          <w:between w:space="0" w:sz="0" w:val="nil"/>
-        </w:pBdr>
-        <w:shd w:fill="auto" w:val="clear"/>
-        <w:spacing w:after="0" w:before="0" w:line="276" w:lineRule="auto"/>
-        <w:ind w:left="0" w:right="0" w:firstLine="0"/>
-        <w:jc w:val="left"/>
-        <w:rPr/>
-      </w:pPr>
-      <w:r>
-        <w:rPr>
-          <w:rtl w:val="0"/>
-        </w:rPr>
-      </w:r>
-    </w:p>
-    <w:p>
-      <w:pPr>
-        <w:keepNext w:val="0"/>
-        <w:keepLines w:val="0"/>
-        <w:pageBreakBefore w:val="0"/>
-        <w:widowControl w:val="1"/>
-        <w:pBdr>
-          <w:top w:space="0" w:sz="0" w:val="nil"/>
-          <w:left w:space="0" w:sz="0" w:val="nil"/>
-          <w:bottom w:space="0" w:sz="0" w:val="nil"/>
-          <w:right w:space="0" w:sz="0" w:val="nil"/>
-          <w:between w:space="0" w:sz="0" w:val="nil"/>
-        </w:pBdr>
-        <w:shd w:fill="auto" w:val="clear"/>
-        <w:spacing w:after="0" w:before="0" w:line="276" w:lineRule="auto"/>
-        <w:ind w:left="0" w:right="0" w:firstLine="0"/>
-        <w:jc w:val="left"/>
-        <w:rPr>
           <w:rFonts w:ascii="Arial" w:cs="Arial" w:eastAsia="Arial" w:hAnsi="Arial"/>
           <w:b w:val="0"/>
           <w:bCs w:val="0"/>
@@ -1096,7 +1079,110 @@
           <w:u w:val="none"/>
           <w:shd w:fill="auto" w:val="clear"/>
           <w:vertAlign w:val="baseline"/>
-        </w:rPr>
+          <w:rtl w:val="0"/>
+        </w:rPr>
+        <w:t xml:space="preserve">Sau khi tải, đặt công cụ vào folder {project_name}. </w:t>
+      </w:r>
+    </w:p>
+    <w:p>
+      <w:pPr>
+        <w:keepNext w:val="0"/>
+        <w:keepLines w:val="0"/>
+        <w:pageBreakBefore w:val="0"/>
+        <w:widowControl w:val="1"/>
+        <w:pBdr>
+          <w:top w:space="0" w:sz="0" w:val="nil"/>
+          <w:left w:space="0" w:sz="0" w:val="nil"/>
+          <w:bottom w:space="0" w:sz="0" w:val="nil"/>
+          <w:right w:space="0" w:sz="0" w:val="nil"/>
+          <w:between w:space="0" w:sz="0" w:val="nil"/>
+        </w:pBdr>
+        <w:shd w:fill="auto" w:val="clear"/>
+        <w:spacing w:after="0" w:before="0" w:line="276" w:lineRule="auto"/>
+        <w:ind w:left="0" w:right="0" w:firstLine="0"/>
+        <w:jc w:val="left"/>
+        <w:rPr>
+          <w:b w:val="1"/>
+          <w:bCs w:val="1"/>
+          <w:i w:val="0"/>
+          <w:iCs w:val="0"/>
+          <w:smallCaps w:val="0"/>
+          <w:strike w:val="0"/>
+          <w:color w:val="000000"/>
+          <w:sz w:val="21"/>
+          <w:szCs w:val="21"/>
+          <w:u w:val="none"/>
+          <w:shd w:fill="auto" w:val="clear"/>
+          <w:vertAlign w:val="baseline"/>
+        </w:rPr>
+      </w:pPr>
+      <w:r>
+        <w:rPr>
+          <w:b w:val="1"/>
+          <w:bCs w:val="1"/>
+          <w:i w:val="0"/>
+          <w:iCs w:val="0"/>
+          <w:smallCaps w:val="0"/>
+          <w:strike w:val="0"/>
+          <w:color w:val="000000"/>
+          <w:sz w:val="21"/>
+          <w:szCs w:val="21"/>
+          <w:u w:val="none"/>
+          <w:shd w:fill="auto" w:val="clear"/>
+          <w:vertAlign w:val="baseline"/>
+          <w:rtl w:val="0"/>
+        </w:rPr>
+        <w:t xml:space="preserve">Cấu trúc </w:t>
+      </w:r>
+      <w:r>
+        <w:rPr>
+          <w:b w:val="1"/>
+          <w:bCs w:val="1"/>
+          <w:rtl w:val="0"/>
+        </w:rPr>
+        <w:t xml:space="preserve">yêu cầu</w:t>
+      </w:r>
+      <w:r>
+        <w:rPr>
+          <w:b w:val="1"/>
+          <w:bCs w:val="1"/>
+          <w:i w:val="0"/>
+          <w:iCs w:val="0"/>
+          <w:smallCaps w:val="0"/>
+          <w:strike w:val="0"/>
+          <w:color w:val="000000"/>
+          <w:sz w:val="21"/>
+          <w:szCs w:val="21"/>
+          <w:u w:val="none"/>
+          <w:shd w:fill="auto" w:val="clear"/>
+          <w:vertAlign w:val="baseline"/>
+          <w:rtl w:val="0"/>
+        </w:rPr>
+        <w:t xml:space="preserve">:</w:t>
+      </w:r>
+    </w:p>
+    <w:p>
+      <w:pPr>
+        <w:keepNext w:val="0"/>
+        <w:keepLines w:val="0"/>
+        <w:pageBreakBefore w:val="0"/>
+        <w:widowControl w:val="1"/>
+        <w:numPr>
+          <w:ilvl w:val="0"/>
+          <w:numId w:val="5"/>
+        </w:numPr>
+        <w:pBdr>
+          <w:top w:space="0" w:sz="0" w:val="nil"/>
+          <w:left w:space="0" w:sz="0" w:val="nil"/>
+          <w:bottom w:space="0" w:sz="0" w:val="nil"/>
+          <w:right w:space="0" w:sz="0" w:val="nil"/>
+          <w:between w:space="0" w:sz="0" w:val="nil"/>
+        </w:pBdr>
+        <w:shd w:fill="auto" w:val="clear"/>
+        <w:spacing w:after="0" w:before="0" w:line="276" w:lineRule="auto"/>
+        <w:ind w:left="360" w:right="0" w:hanging="360"/>
+        <w:jc w:val="left"/>
+        <w:rPr/>
       </w:pPr>
       <w:r>
         <w:rPr>
@@ -1115,7 +1201,7 @@
           <w:vertAlign w:val="baseline"/>
           <w:rtl w:val="0"/>
         </w:rPr>
-        <w:t xml:space="preserve">Sau khi tải, đặt công cụ vào folder {project_name}. </w:t>
+        <w:t xml:space="preserve">{project_name}/</w:t>
       </w:r>
     </w:p>
     <w:p>
@@ -1124,6 +1210,10 @@
         <w:keepLines w:val="0"/>
         <w:pageBreakBefore w:val="0"/>
         <w:widowControl w:val="1"/>
+        <w:numPr>
+          <w:ilvl w:val="0"/>
+          <w:numId w:val="5"/>
+        </w:numPr>
         <w:pBdr>
           <w:top w:space="0" w:sz="0" w:val="nil"/>
           <w:left w:space="0" w:sz="0" w:val="nil"/>
@@ -1133,8 +1223,11 @@
         </w:pBdr>
         <w:shd w:fill="auto" w:val="clear"/>
         <w:spacing w:after="0" w:before="0" w:line="276" w:lineRule="auto"/>
-        <w:ind w:left="0" w:right="0" w:firstLine="0"/>
+        <w:ind w:left="360" w:right="0" w:hanging="360"/>
         <w:jc w:val="left"/>
+        <w:rPr/>
+      </w:pPr>
+      <w:r>
         <w:rPr>
           <w:rFonts w:ascii="Arial" w:cs="Arial" w:eastAsia="Arial" w:hAnsi="Arial"/>
           <w:b w:val="0"/>
@@ -1149,7 +1242,51 @@
           <w:u w:val="none"/>
           <w:shd w:fill="auto" w:val="clear"/>
           <w:vertAlign w:val="baseline"/>
-        </w:rPr>
+          <w:rtl w:val="0"/>
+        </w:rPr>
+        <w:t xml:space="preserve">├── </w:t>
+      </w:r>
+      <w:r>
+        <w:rPr>
+          <w:b w:val="1"/>
+          <w:bCs w:val="1"/>
+          <w:i w:val="0"/>
+          <w:iCs w:val="0"/>
+          <w:smallCaps w:val="0"/>
+          <w:strike w:val="0"/>
+          <w:color w:val="000000"/>
+          <w:sz w:val="21"/>
+          <w:szCs w:val="21"/>
+          <w:u w:val="none"/>
+          <w:shd w:fill="auto" w:val="clear"/>
+          <w:vertAlign w:val="baseline"/>
+          <w:rtl w:val="0"/>
+        </w:rPr>
+        <w:t xml:space="preserve">requirements/</w:t>
+      </w:r>
+    </w:p>
+    <w:p>
+      <w:pPr>
+        <w:keepNext w:val="0"/>
+        <w:keepLines w:val="0"/>
+        <w:pageBreakBefore w:val="0"/>
+        <w:widowControl w:val="1"/>
+        <w:numPr>
+          <w:ilvl w:val="0"/>
+          <w:numId w:val="5"/>
+        </w:numPr>
+        <w:pBdr>
+          <w:top w:space="0" w:sz="0" w:val="nil"/>
+          <w:left w:space="0" w:sz="0" w:val="nil"/>
+          <w:bottom w:space="0" w:sz="0" w:val="nil"/>
+          <w:right w:space="0" w:sz="0" w:val="nil"/>
+          <w:between w:space="0" w:sz="0" w:val="nil"/>
+        </w:pBdr>
+        <w:shd w:fill="auto" w:val="clear"/>
+        <w:spacing w:after="0" w:before="0" w:line="276" w:lineRule="auto"/>
+        <w:ind w:left="360" w:right="0" w:hanging="360"/>
+        <w:jc w:val="left"/>
+        <w:rPr/>
       </w:pPr>
       <w:r>
         <w:rPr>
@@ -1168,7 +1305,7 @@
           <w:vertAlign w:val="baseline"/>
           <w:rtl w:val="0"/>
         </w:rPr>
-        <w:t xml:space="preserve">Cấu trúc mong muốn:</w:t>
+        <w:t xml:space="preserve">├── CLAUDE.md</w:t>
       </w:r>
     </w:p>
     <w:p>
@@ -1179,7 +1316,7 @@
         <w:widowControl w:val="1"/>
         <w:numPr>
           <w:ilvl w:val="0"/>
-          <w:numId w:val="3"/>
+          <w:numId w:val="5"/>
         </w:numPr>
         <w:pBdr>
           <w:top w:space="0" w:sz="0" w:val="nil"/>
@@ -1211,7 +1348,7 @@
           <w:vertAlign w:val="baseline"/>
           <w:rtl w:val="0"/>
         </w:rPr>
-        <w:t xml:space="preserve">{project_name}/</w:t>
+        <w:t xml:space="preserve">├── POLICIES.md</w:t>
       </w:r>
     </w:p>
     <w:p>
@@ -1222,7 +1359,7 @@
         <w:widowControl w:val="1"/>
         <w:numPr>
           <w:ilvl w:val="0"/>
-          <w:numId w:val="3"/>
+          <w:numId w:val="5"/>
         </w:numPr>
         <w:pBdr>
           <w:top w:space="0" w:sz="0" w:val="nil"/>
@@ -1254,7 +1391,7 @@
           <w:vertAlign w:val="baseline"/>
           <w:rtl w:val="0"/>
         </w:rPr>
-        <w:t xml:space="preserve">├── requirements/</w:t>
+        <w:t xml:space="preserve">├── AGENTS.md</w:t>
       </w:r>
     </w:p>
     <w:p>
@@ -1265,7 +1402,7 @@
         <w:widowControl w:val="1"/>
         <w:numPr>
           <w:ilvl w:val="0"/>
-          <w:numId w:val="3"/>
+          <w:numId w:val="5"/>
         </w:numPr>
         <w:pBdr>
           <w:top w:space="0" w:sz="0" w:val="nil"/>
@@ -1297,7 +1434,7 @@
           <w:vertAlign w:val="baseline"/>
           <w:rtl w:val="0"/>
         </w:rPr>
-        <w:t xml:space="preserve">├── CLAUDE.md</w:t>
+        <w:t xml:space="preserve">├── template/</w:t>
       </w:r>
     </w:p>
     <w:p>
@@ -1308,7 +1445,7 @@
         <w:widowControl w:val="1"/>
         <w:numPr>
           <w:ilvl w:val="0"/>
-          <w:numId w:val="3"/>
+          <w:numId w:val="5"/>
         </w:numPr>
         <w:pBdr>
           <w:top w:space="0" w:sz="0" w:val="nil"/>
@@ -1340,7 +1477,38 @@
           <w:vertAlign w:val="baseline"/>
           <w:rtl w:val="0"/>
         </w:rPr>
-        <w:t xml:space="preserve">├── POLICIES.md</w:t>
+        <w:t xml:space="preserve">├──</w:t>
+      </w:r>
+      <w:r>
+        <w:rPr>
+          <w:rFonts w:ascii="Arial" w:cs="Arial" w:eastAsia="Arial" w:hAnsi="Arial"/>
+          <w:b w:val="0"/>
+          <w:bCs w:val="0"/>
+          <w:i w:val="0"/>
+          <w:iCs w:val="0"/>
+          <w:smallCaps w:val="0"/>
+          <w:strike w:val="0"/>
+          <w:color w:val="ff0000"/>
+          <w:sz w:val="21"/>
+          <w:szCs w:val="21"/>
+          <w:u w:val="none"/>
+          <w:shd w:fill="auto" w:val="clear"/>
+          <w:vertAlign w:val="baseline"/>
+          <w:rtl w:val="0"/>
+        </w:rPr>
+        <w:t xml:space="preserve"> .claude/ -&gt; </w:t>
+      </w:r>
+      <w:r>
+        <w:rPr>
+          <w:color w:val="ff0000"/>
+          <w:rtl w:val="0"/>
+        </w:rPr>
+        <w:t xml:space="preserve">quan trọng</w:t>
+      </w:r>
+      <w:r>
+        <w:rPr>
+          <w:rtl w:val="0"/>
+        </w:rPr>
       </w:r>
     </w:p>
     <w:p>
@@ -1351,7 +1519,7 @@
         <w:widowControl w:val="1"/>
         <w:numPr>
           <w:ilvl w:val="0"/>
-          <w:numId w:val="3"/>
+          <w:numId w:val="5"/>
         </w:numPr>
         <w:pBdr>
           <w:top w:space="0" w:sz="0" w:val="nil"/>
@@ -1361,7 +1529,7 @@
           <w:between w:space="0" w:sz="0" w:val="nil"/>
         </w:pBdr>
         <w:shd w:fill="auto" w:val="clear"/>
-        <w:spacing w:after="0" w:before="0" w:line="276" w:lineRule="auto"/>
+        <w:spacing w:after="200" w:before="0" w:line="276" w:lineRule="auto"/>
         <w:ind w:left="360" w:right="0" w:hanging="360"/>
         <w:jc w:val="left"/>
         <w:rPr/>
@@ -1383,7 +1551,186 @@
           <w:vertAlign w:val="baseline"/>
           <w:rtl w:val="0"/>
         </w:rPr>
-        <w:t xml:space="preserve">├── AGENTS.md</w:t>
+        <w:t xml:space="preserve">└── README.md</w:t>
+      </w:r>
+    </w:p>
+    <w:p>
+      <w:pPr>
+        <w:rPr>
+          <w:color w:val="ff0000"/>
+          <w:sz w:val="25"/>
+          <w:szCs w:val="25"/>
+        </w:rPr>
+      </w:pPr>
+      <w:r>
+        <w:rPr>
+          <w:b w:val="1"/>
+          <w:bCs w:val="1"/>
+          <w:rtl w:val="0"/>
+        </w:rPr>
+        <w:t xml:space="preserve">Lưu ý: </w:t>
+      </w:r>
+      <w:r>
+        <w:rPr>
+          <w:rtl w:val="0"/>
+        </w:rPr>
+        <w:t xml:space="preserve">Đảm bảo các file cấu hình của kit nằm đúng cấp thư mục của {project_name}.</w:t>
+      </w:r>
+      <w:r>
+        <w:rPr>
+          <w:color w:val="ff0000"/>
+          <w:sz w:val="25"/>
+          <w:szCs w:val="25"/>
+          <w:rtl w:val="0"/>
+        </w:rPr>
+        <w:t xml:space="preserve"> Phải có thư mục </w:t>
+      </w:r>
+      <w:r>
+        <w:rPr>
+          <w:b w:val="1"/>
+          <w:bCs w:val="1"/>
+          <w:color w:val="ff0000"/>
+          <w:sz w:val="25"/>
+          <w:szCs w:val="25"/>
+          <w:rtl w:val="0"/>
+        </w:rPr>
+        <w:t xml:space="preserve">.claude </w:t>
+      </w:r>
+      <w:r>
+        <w:rPr>
+          <w:color w:val="ff0000"/>
+          <w:sz w:val="25"/>
+          <w:szCs w:val="25"/>
+          <w:rtl w:val="0"/>
+        </w:rPr>
+        <w:t xml:space="preserve">trong folder làm việc. Nếu không, sẽ không thể chạy đúng được. </w:t>
+      </w:r>
+    </w:p>
+    <w:p>
+      <w:pPr>
+        <w:rPr/>
+      </w:pPr>
+      <w:r>
+        <w:rPr>
+          <w:rtl w:val="0"/>
+        </w:rPr>
+        <w:t xml:space="preserve">Thư mục này thường bị ẩn khi xem trên Macbook nên cách tốt nhất </w:t>
+      </w:r>
+    </w:p>
+    <w:p>
+      <w:pPr>
+        <w:rPr/>
+      </w:pPr>
+      <w:r>
+        <w:rPr>
+          <w:rtl w:val="0"/>
+        </w:rPr>
+        <w:t xml:space="preserve">1- Sử dụng tổ hợp phím tắt dể nó hiện lên trong file giải nén : shift + command + “dấu chấm . “ -&gt; HOẶC </w:t>
+        <w:br w:type="textWrapping"/>
+        <w:t xml:space="preserve">2- đưa folder “requirements/” bạn tạo vào trong folder mà bạn đã giải nén file .zip . -&gt; HOẶC </w:t>
+        <w:br w:type="textWrapping"/>
+        <w:t xml:space="preserve">3- dùng công cụ IDE để xem như “Visual Code”,...</w:t>
+      </w:r>
+    </w:p>
+    <w:p>
+      <w:pPr>
+        <w:jc w:val="center"/>
+        <w:rPr/>
+      </w:pPr>
+      <w:r>
+        <w:rPr/>
+        <w:drawing>
+          <wp:inline distB="0" distT="0" distL="0" distR="0">
+            <wp:extent cx="2241382" cy="2803653"/>
+            <wp:effectExtent b="0" l="0" r="0" t="0"/>
+            <wp:docPr id="1997424754" name="image12.png"/>
+            <a:graphic>
+              <a:graphicData uri="http://schemas.openxmlformats.org/drawingml/2006/picture">
+                <pic:pic>
+                  <pic:nvPicPr>
+                    <pic:cNvPr id="0" name="image12.png"/>
+                    <pic:cNvPicPr preferRelativeResize="0"/>
+                  </pic:nvPicPr>
+                  <pic:blipFill>
+                    <a:blip r:embed="rId11"/>
+                    <a:srcRect b="0" l="0" r="0" t="0"/>
+                    <a:stretch>
+                      <a:fillRect/>
+                    </a:stretch>
+                  </pic:blipFill>
+                  <pic:spPr>
+                    <a:xfrm>
+                      <a:off x="0" y="0"/>
+                      <a:ext cx="2241382" cy="2803653"/>
+                    </a:xfrm>
+                    <a:prstGeom prst="rect"/>
+                    <a:ln/>
+                  </pic:spPr>
+                </pic:pic>
+              </a:graphicData>
+            </a:graphic>
+          </wp:inline>
+        </w:drawing>
+      </w:r>
+      <w:r>
+        <w:rPr>
+          <w:rtl w:val="0"/>
+        </w:rPr>
+      </w:r>
+    </w:p>
+    <w:p>
+      <w:pPr>
+        <w:jc w:val="center"/>
+        <w:rPr/>
+      </w:pPr>
+      <w:r>
+        <w:rPr>
+          <w:i w:val="1"/>
+          <w:iCs w:val="1"/>
+          <w:sz w:val="18"/>
+          <w:szCs w:val="18"/>
+          <w:rtl w:val="0"/>
+        </w:rPr>
+        <w:t xml:space="preserve">Hình minh họa — Bước 3</w:t>
+      </w:r>
+      <w:r>
+        <w:rPr>
+          <w:rtl w:val="0"/>
+        </w:rPr>
+      </w:r>
+    </w:p>
+    <w:p>
+      <w:pPr>
+        <w:pStyle w:val="Heading1"/>
+        <w:rPr/>
+      </w:pPr>
+      <w:bookmarkStart w:colFirst="0" w:colLast="0" w:name="_heading=h.shw1pwaxtev9" w:id="3"/>
+      <w:bookmarkEnd w:id="3"/>
+      <w:r>
+        <w:rPr>
+          <w:b w:val="1"/>
+          <w:bCs w:val="1"/>
+          <w:sz w:val="32"/>
+          <w:szCs w:val="32"/>
+          <w:rtl w:val="0"/>
+        </w:rPr>
+        <w:t xml:space="preserve">BƯỚC 4 — YÊU CẦU BA AGENT PHÂN TÍCH</w:t>
+      </w:r>
+      <w:r>
+        <w:rPr>
+          <w:rtl w:val="0"/>
+        </w:rPr>
+      </w:r>
+    </w:p>
+    <w:p>
+      <w:pPr>
+        <w:rPr/>
+      </w:pPr>
+      <w:r>
+        <w:rPr>
+          <w:rtl w:val="0"/>
+        </w:rPr>
+        <w:t xml:space="preserve">Sau khi chuẩn bị xong, mở Claude và yêu cầu BA Agent phân tích folder cần làm.</w:t>
       </w:r>
     </w:p>
     <w:p>
@@ -1394,7 +1741,7 @@
         <w:widowControl w:val="1"/>
         <w:numPr>
           <w:ilvl w:val="0"/>
-          <w:numId w:val="3"/>
+          <w:numId w:val="5"/>
         </w:numPr>
         <w:pBdr>
           <w:top w:space="0" w:sz="0" w:val="nil"/>
@@ -1426,7 +1773,7 @@
           <w:vertAlign w:val="baseline"/>
           <w:rtl w:val="0"/>
         </w:rPr>
-        <w:t xml:space="preserve">├── template/</w:t>
+        <w:t xml:space="preserve">Prompt:</w:t>
       </w:r>
     </w:p>
     <w:p>
@@ -1437,7 +1784,7 @@
         <w:widowControl w:val="1"/>
         <w:numPr>
           <w:ilvl w:val="0"/>
-          <w:numId w:val="3"/>
+          <w:numId w:val="5"/>
         </w:numPr>
         <w:pBdr>
           <w:top w:space="0" w:sz="0" w:val="nil"/>
@@ -1469,7 +1816,7 @@
           <w:vertAlign w:val="baseline"/>
           <w:rtl w:val="0"/>
         </w:rPr>
-        <w:t xml:space="preserve">├── .claude/</w:t>
+        <w:t xml:space="preserve">“Hãy là BA Agent, phân tích &lt;link tới folder cần làm&gt;”</w:t>
       </w:r>
     </w:p>
     <w:p>
@@ -1480,7 +1827,7 @@
         <w:widowControl w:val="1"/>
         <w:numPr>
           <w:ilvl w:val="0"/>
-          <w:numId w:val="3"/>
+          <w:numId w:val="5"/>
         </w:numPr>
         <w:pBdr>
           <w:top w:space="0" w:sz="0" w:val="nil"/>
@@ -1490,7 +1837,7 @@
           <w:between w:space="0" w:sz="0" w:val="nil"/>
         </w:pBdr>
         <w:shd w:fill="auto" w:val="clear"/>
-        <w:spacing w:after="200" w:before="0" w:line="276" w:lineRule="auto"/>
+        <w:spacing w:after="0" w:before="0" w:line="276" w:lineRule="auto"/>
         <w:ind w:left="360" w:right="0" w:hanging="360"/>
         <w:jc w:val="left"/>
         <w:rPr/>
@@ -1512,140 +1859,7 @@
           <w:vertAlign w:val="baseline"/>
           <w:rtl w:val="0"/>
         </w:rPr>
-        <w:t xml:space="preserve">└── README.md</w:t>
-      </w:r>
-    </w:p>
-    <w:p>
-      <w:pPr>
-        <w:rPr/>
-      </w:pPr>
-      <w:r>
-        <w:rPr>
-          <w:b w:val="1"/>
-          <w:bCs w:val="1"/>
-          <w:rtl w:val="0"/>
-        </w:rPr>
-        <w:t xml:space="preserve">Lưu ý: </w:t>
-      </w:r>
-      <w:r>
-        <w:rPr>
-          <w:rtl w:val="0"/>
-        </w:rPr>
-        <w:t xml:space="preserve">Đảm bảo các file cấu hình của kit nằm đúng cấp thư mục của {project_name}.</w:t>
-      </w:r>
-    </w:p>
-    <w:p>
-      <w:pPr>
-        <w:jc w:val="center"/>
-        <w:rPr/>
-      </w:pPr>
-      <w:r>
-        <w:rPr/>
-        <w:drawing>
-          <wp:inline distB="0" distT="0" distL="0" distR="0">
-            <wp:extent cx="3051493" cy="3814366"/>
-            <wp:effectExtent b="0" l="0" r="0" t="0"/>
-            <wp:docPr id="1997424751" name="image14.png"/>
-            <a:graphic>
-              <a:graphicData uri="http://schemas.openxmlformats.org/drawingml/2006/picture">
-                <pic:pic>
-                  <pic:nvPicPr>
-                    <pic:cNvPr id="0" name="image14.png"/>
-                    <pic:cNvPicPr preferRelativeResize="0"/>
-                  </pic:nvPicPr>
-                  <pic:blipFill>
-                    <a:blip r:embed="rId11"/>
-                    <a:srcRect b="0" l="0" r="0" t="0"/>
-                    <a:stretch>
-                      <a:fillRect/>
-                    </a:stretch>
-                  </pic:blipFill>
-                  <pic:spPr>
-                    <a:xfrm>
-                      <a:off x="0" y="0"/>
-                      <a:ext cx="3051493" cy="3814366"/>
-                    </a:xfrm>
-                    <a:prstGeom prst="rect"/>
-                    <a:ln/>
-                  </pic:spPr>
-                </pic:pic>
-              </a:graphicData>
-            </a:graphic>
-          </wp:inline>
-        </w:drawing>
-      </w:r>
-      <w:r>
-        <w:rPr>
-          <w:rtl w:val="0"/>
-        </w:rPr>
-      </w:r>
-    </w:p>
-    <w:p>
-      <w:pPr>
-        <w:jc w:val="center"/>
-        <w:rPr/>
-      </w:pPr>
-      <w:r>
-        <w:rPr>
-          <w:i w:val="1"/>
-          <w:iCs w:val="1"/>
-          <w:sz w:val="18"/>
-          <w:szCs w:val="18"/>
-          <w:rtl w:val="0"/>
-        </w:rPr>
-        <w:t xml:space="preserve">Hình minh họa — Bước 3</w:t>
-      </w:r>
-      <w:r>
-        <w:rPr>
-          <w:rtl w:val="0"/>
-        </w:rPr>
-      </w:r>
-    </w:p>
-    <w:p>
-      <w:pPr>
-        <w:rPr/>
-      </w:pPr>
-      <w:r>
-        <w:br w:type="page"/>
-      </w:r>
-      <w:r>
-        <w:rPr>
-          <w:rtl w:val="0"/>
-        </w:rPr>
-      </w:r>
-    </w:p>
-    <w:p>
-      <w:pPr>
-        <w:pStyle w:val="Heading1"/>
-        <w:rPr/>
-      </w:pPr>
-      <w:bookmarkStart w:colFirst="0" w:colLast="0" w:name="_heading=h.shw1pwaxtev9" w:id="3"/>
-      <w:bookmarkEnd w:id="3"/>
-      <w:r>
-        <w:rPr>
-          <w:b w:val="1"/>
-          <w:bCs w:val="1"/>
-          <w:sz w:val="32"/>
-          <w:szCs w:val="32"/>
-          <w:rtl w:val="0"/>
-        </w:rPr>
-        <w:t xml:space="preserve">BƯỚC 4 — YÊU CẦU BA AGENT PHÂN TÍCH</w:t>
-      </w:r>
-      <w:r>
-        <w:rPr>
-          <w:rtl w:val="0"/>
-        </w:rPr>
-      </w:r>
-    </w:p>
-    <w:p>
-      <w:pPr>
-        <w:rPr/>
-      </w:pPr>
-      <w:r>
-        <w:rPr>
-          <w:rtl w:val="0"/>
-        </w:rPr>
-        <w:t xml:space="preserve">Sau khi chuẩn bị xong, mở Claude và yêu cầu BA Agent phân tích folder cần làm.</w:t>
+        <w:t xml:space="preserve">Ví dụ:</w:t>
       </w:r>
     </w:p>
     <w:p>
@@ -1656,7 +1870,7 @@
         <w:widowControl w:val="1"/>
         <w:numPr>
           <w:ilvl w:val="0"/>
-          <w:numId w:val="3"/>
+          <w:numId w:val="5"/>
         </w:numPr>
         <w:pBdr>
           <w:top w:space="0" w:sz="0" w:val="nil"/>
@@ -1666,7 +1880,7 @@
           <w:between w:space="0" w:sz="0" w:val="nil"/>
         </w:pBdr>
         <w:shd w:fill="auto" w:val="clear"/>
-        <w:spacing w:after="0" w:before="0" w:line="276" w:lineRule="auto"/>
+        <w:spacing w:after="200" w:before="0" w:line="276" w:lineRule="auto"/>
         <w:ind w:left="360" w:right="0" w:hanging="360"/>
         <w:jc w:val="left"/>
         <w:rPr/>
@@ -1688,135 +1902,6 @@
           <w:vertAlign w:val="baseline"/>
           <w:rtl w:val="0"/>
         </w:rPr>
-        <w:t xml:space="preserve">Prompt:</w:t>
-      </w:r>
-    </w:p>
-    <w:p>
-      <w:pPr>
-        <w:keepNext w:val="0"/>
-        <w:keepLines w:val="0"/>
-        <w:pageBreakBefore w:val="0"/>
-        <w:widowControl w:val="1"/>
-        <w:numPr>
-          <w:ilvl w:val="0"/>
-          <w:numId w:val="3"/>
-        </w:numPr>
-        <w:pBdr>
-          <w:top w:space="0" w:sz="0" w:val="nil"/>
-          <w:left w:space="0" w:sz="0" w:val="nil"/>
-          <w:bottom w:space="0" w:sz="0" w:val="nil"/>
-          <w:right w:space="0" w:sz="0" w:val="nil"/>
-          <w:between w:space="0" w:sz="0" w:val="nil"/>
-        </w:pBdr>
-        <w:shd w:fill="auto" w:val="clear"/>
-        <w:spacing w:after="0" w:before="0" w:line="276" w:lineRule="auto"/>
-        <w:ind w:left="360" w:right="0" w:hanging="360"/>
-        <w:jc w:val="left"/>
-        <w:rPr/>
-      </w:pPr>
-      <w:r>
-        <w:rPr>
-          <w:rFonts w:ascii="Arial" w:cs="Arial" w:eastAsia="Arial" w:hAnsi="Arial"/>
-          <w:b w:val="0"/>
-          <w:bCs w:val="0"/>
-          <w:i w:val="0"/>
-          <w:iCs w:val="0"/>
-          <w:smallCaps w:val="0"/>
-          <w:strike w:val="0"/>
-          <w:color w:val="000000"/>
-          <w:sz w:val="21"/>
-          <w:szCs w:val="21"/>
-          <w:u w:val="none"/>
-          <w:shd w:fill="auto" w:val="clear"/>
-          <w:vertAlign w:val="baseline"/>
-          <w:rtl w:val="0"/>
-        </w:rPr>
-        <w:t xml:space="preserve">“Hãy là BA Agent, phân tích &lt;link tới folder cần làm&gt;”</w:t>
-      </w:r>
-    </w:p>
-    <w:p>
-      <w:pPr>
-        <w:keepNext w:val="0"/>
-        <w:keepLines w:val="0"/>
-        <w:pageBreakBefore w:val="0"/>
-        <w:widowControl w:val="1"/>
-        <w:numPr>
-          <w:ilvl w:val="0"/>
-          <w:numId w:val="3"/>
-        </w:numPr>
-        <w:pBdr>
-          <w:top w:space="0" w:sz="0" w:val="nil"/>
-          <w:left w:space="0" w:sz="0" w:val="nil"/>
-          <w:bottom w:space="0" w:sz="0" w:val="nil"/>
-          <w:right w:space="0" w:sz="0" w:val="nil"/>
-          <w:between w:space="0" w:sz="0" w:val="nil"/>
-        </w:pBdr>
-        <w:shd w:fill="auto" w:val="clear"/>
-        <w:spacing w:after="0" w:before="0" w:line="276" w:lineRule="auto"/>
-        <w:ind w:left="360" w:right="0" w:hanging="360"/>
-        <w:jc w:val="left"/>
-        <w:rPr/>
-      </w:pPr>
-      <w:r>
-        <w:rPr>
-          <w:rFonts w:ascii="Arial" w:cs="Arial" w:eastAsia="Arial" w:hAnsi="Arial"/>
-          <w:b w:val="0"/>
-          <w:bCs w:val="0"/>
-          <w:i w:val="0"/>
-          <w:iCs w:val="0"/>
-          <w:smallCaps w:val="0"/>
-          <w:strike w:val="0"/>
-          <w:color w:val="000000"/>
-          <w:sz w:val="21"/>
-          <w:szCs w:val="21"/>
-          <w:u w:val="none"/>
-          <w:shd w:fill="auto" w:val="clear"/>
-          <w:vertAlign w:val="baseline"/>
-          <w:rtl w:val="0"/>
-        </w:rPr>
-        <w:t xml:space="preserve">Ví dụ:</w:t>
-      </w:r>
-    </w:p>
-    <w:p>
-      <w:pPr>
-        <w:keepNext w:val="0"/>
-        <w:keepLines w:val="0"/>
-        <w:pageBreakBefore w:val="0"/>
-        <w:widowControl w:val="1"/>
-        <w:numPr>
-          <w:ilvl w:val="0"/>
-          <w:numId w:val="3"/>
-        </w:numPr>
-        <w:pBdr>
-          <w:top w:space="0" w:sz="0" w:val="nil"/>
-          <w:left w:space="0" w:sz="0" w:val="nil"/>
-          <w:bottom w:space="0" w:sz="0" w:val="nil"/>
-          <w:right w:space="0" w:sz="0" w:val="nil"/>
-          <w:between w:space="0" w:sz="0" w:val="nil"/>
-        </w:pBdr>
-        <w:shd w:fill="auto" w:val="clear"/>
-        <w:spacing w:after="200" w:before="0" w:line="276" w:lineRule="auto"/>
-        <w:ind w:left="360" w:right="0" w:hanging="360"/>
-        <w:jc w:val="left"/>
-        <w:rPr/>
-      </w:pPr>
-      <w:r>
-        <w:rPr>
-          <w:rFonts w:ascii="Arial" w:cs="Arial" w:eastAsia="Arial" w:hAnsi="Arial"/>
-          <w:b w:val="0"/>
-          <w:bCs w:val="0"/>
-          <w:i w:val="0"/>
-          <w:iCs w:val="0"/>
-          <w:smallCaps w:val="0"/>
-          <w:strike w:val="0"/>
-          <w:color w:val="000000"/>
-          <w:sz w:val="21"/>
-          <w:szCs w:val="21"/>
-          <w:u w:val="none"/>
-          <w:shd w:fill="auto" w:val="clear"/>
-          <w:vertAlign w:val="baseline"/>
-          <w:rtl w:val="0"/>
-        </w:rPr>
         <w:t xml:space="preserve">“Hãy là BA Agent, phân tích &lt;link tới folder feature_A&gt;”</w:t>
       </w:r>
     </w:p>
@@ -1850,12 +1935,12 @@
           <wp:inline distB="0" distT="0" distL="0" distR="0">
             <wp:extent cx="4880801" cy="4586776"/>
             <wp:effectExtent b="0" l="0" r="0" t="0"/>
-            <wp:docPr id="1997424754" name="image5.png"/>
+            <wp:docPr id="1997424757" name="image9.png"/>
             <a:graphic>
               <a:graphicData uri="http://schemas.openxmlformats.org/drawingml/2006/picture">
                 <pic:pic>
                   <pic:nvPicPr>
-                    <pic:cNvPr id="0" name="image5.png"/>
+                    <pic:cNvPr id="0" name="image9.png"/>
                     <pic:cNvPicPr preferRelativeResize="0"/>
                   </pic:nvPicPr>
                   <pic:blipFill>
@@ -1961,7 +2046,7 @@
         <w:widowControl w:val="1"/>
         <w:numPr>
           <w:ilvl w:val="0"/>
-          <w:numId w:val="3"/>
+          <w:numId w:val="5"/>
         </w:numPr>
         <w:pBdr>
           <w:top w:space="0" w:sz="0" w:val="nil"/>
@@ -2004,7 +2089,7 @@
         <w:widowControl w:val="1"/>
         <w:numPr>
           <w:ilvl w:val="0"/>
-          <w:numId w:val="3"/>
+          <w:numId w:val="5"/>
         </w:numPr>
         <w:pBdr>
           <w:top w:space="0" w:sz="0" w:val="nil"/>
@@ -2047,7 +2132,7 @@
         <w:widowControl w:val="1"/>
         <w:numPr>
           <w:ilvl w:val="0"/>
-          <w:numId w:val="3"/>
+          <w:numId w:val="5"/>
         </w:numPr>
         <w:pBdr>
           <w:top w:space="0" w:sz="0" w:val="nil"/>
@@ -2112,12 +2197,12 @@
           <wp:inline distB="0" distT="0" distL="0" distR="0">
             <wp:extent cx="5989320" cy="4866322"/>
             <wp:effectExtent b="0" l="0" r="0" t="0"/>
-            <wp:docPr id="1997424753" name="image6.png"/>
+            <wp:docPr id="1997424756" name="image3.png"/>
             <a:graphic>
               <a:graphicData uri="http://schemas.openxmlformats.org/drawingml/2006/picture">
                 <pic:pic>
                   <pic:nvPicPr>
-                    <pic:cNvPr id="0" name="image6.png"/>
+                    <pic:cNvPr id="0" name="image3.png"/>
                     <pic:cNvPicPr preferRelativeResize="0"/>
                   </pic:nvPicPr>
                   <pic:blipFill>
@@ -2223,7 +2308,7 @@
         <w:widowControl w:val="1"/>
         <w:numPr>
           <w:ilvl w:val="0"/>
-          <w:numId w:val="3"/>
+          <w:numId w:val="5"/>
         </w:numPr>
         <w:pBdr>
           <w:top w:space="0" w:sz="0" w:val="nil"/>
@@ -2266,7 +2351,7 @@
         <w:widowControl w:val="1"/>
         <w:numPr>
           <w:ilvl w:val="0"/>
-          <w:numId w:val="3"/>
+          <w:numId w:val="5"/>
         </w:numPr>
         <w:pBdr>
           <w:top w:space="0" w:sz="0" w:val="nil"/>
@@ -2309,7 +2394,7 @@
         <w:widowControl w:val="1"/>
         <w:numPr>
           <w:ilvl w:val="0"/>
-          <w:numId w:val="3"/>
+          <w:numId w:val="5"/>
         </w:numPr>
         <w:pBdr>
           <w:top w:space="0" w:sz="0" w:val="nil"/>
@@ -2352,7 +2437,7 @@
         <w:widowControl w:val="1"/>
         <w:numPr>
           <w:ilvl w:val="0"/>
-          <w:numId w:val="3"/>
+          <w:numId w:val="5"/>
         </w:numPr>
         <w:pBdr>
           <w:top w:space="0" w:sz="0" w:val="nil"/>
@@ -2395,7 +2480,7 @@
         <w:widowControl w:val="1"/>
         <w:numPr>
           <w:ilvl w:val="0"/>
-          <w:numId w:val="3"/>
+          <w:numId w:val="5"/>
         </w:numPr>
         <w:pBdr>
           <w:top w:space="0" w:sz="0" w:val="nil"/>
@@ -2754,12 +2839,12 @@
               <wp:inline distB="0" distT="0" distL="0" distR="0">
                 <wp:extent cx="318135" cy="318135"/>
                 <wp:effectExtent b="0" l="0" r="0" t="0"/>
-                <wp:docPr descr="Output 1 — Flow Tổng Quan" id="1997424742" name="image16.png"/>
+                <wp:docPr descr="Output 1 — Flow Tổng Quan" id="1997424742" name="image22.png"/>
                 <a:graphic>
                   <a:graphicData uri="http://schemas.openxmlformats.org/drawingml/2006/picture">
                     <pic:pic>
                       <pic:nvPicPr>
-                        <pic:cNvPr descr="Output 1 — Flow Tổng Quan" id="0" name="image16.png"/>
+                        <pic:cNvPr descr="Output 1 — Flow Tổng Quan" id="0" name="image22.png"/>
                         <pic:cNvPicPr preferRelativeResize="0"/>
                       </pic:nvPicPr>
                       <pic:blipFill>
@@ -2805,7 +2890,7 @@
           <wp:inline distB="0" distT="0" distL="0" distR="0">
             <wp:extent cx="6583680" cy="4857750"/>
             <wp:effectExtent b="0" l="0" r="0" t="0"/>
-            <wp:docPr id="1997424755" name="image2.jpg"/>
+            <wp:docPr id="1997424758" name="image2.jpg"/>
             <a:graphic>
               <a:graphicData uri="http://schemas.openxmlformats.org/drawingml/2006/picture">
                 <pic:pic>
@@ -3039,12 +3124,12 @@
               <wp:inline distB="0" distT="0" distL="0" distR="0">
                 <wp:extent cx="318135" cy="318135"/>
                 <wp:effectExtent b="0" l="0" r="0" t="0"/>
-                <wp:docPr descr="Output 2 — Screen Flow" id="1997424741" name="image15.png"/>
+                <wp:docPr descr="Output 2 — Screen Flow" id="1997424741" name="image21.png"/>
                 <a:graphic>
                   <a:graphicData uri="http://schemas.openxmlformats.org/drawingml/2006/picture">
                     <pic:pic>
                       <pic:nvPicPr>
-                        <pic:cNvPr descr="Output 2 — Screen Flow" id="0" name="image15.png"/>
+                        <pic:cNvPr descr="Output 2 — Screen Flow" id="0" name="image21.png"/>
                         <pic:cNvPicPr preferRelativeResize="0"/>
                       </pic:nvPicPr>
                       <pic:blipFill>
@@ -3076,12 +3161,12 @@
           <wp:inline distB="114300" distT="114300" distL="114300" distR="114300">
             <wp:extent cx="6583680" cy="5016500"/>
             <wp:effectExtent b="0" l="0" r="0" t="0"/>
-            <wp:docPr id="1997424747" name="image9.jpg"/>
+            <wp:docPr id="1997424748" name="image8.jpg"/>
             <a:graphic>
               <a:graphicData uri="http://schemas.openxmlformats.org/drawingml/2006/picture">
                 <pic:pic>
                   <pic:nvPicPr>
-                    <pic:cNvPr id="0" name="image9.jpg"/>
+                    <pic:cNvPr id="0" name="image8.jpg"/>
                     <pic:cNvPicPr preferRelativeResize="0"/>
                   </pic:nvPicPr>
                   <pic:blipFill>
@@ -3124,6 +3209,67 @@
           <v:rect style="width:0.0pt;height:1.5pt" o:hr="t" o:hrstd="t" o:hralign="center" fillcolor="#A0A0A0" stroked="f"/>
         </w:pict>
       </w:r>
+      <w:r>
+        <w:rPr>
+          <w:rtl w:val="0"/>
+        </w:rPr>
+      </w:r>
+    </w:p>
+    <w:p>
+      <w:pPr>
+        <w:pStyle w:val="Heading3"/>
+        <w:spacing w:after="240" w:before="360" w:lineRule="auto"/>
+        <w:rPr>
+          <w:rFonts w:ascii="Arial" w:cs="Arial" w:eastAsia="Arial" w:hAnsi="Arial"/>
+          <w:color w:val="000000"/>
+          <w:sz w:val="30"/>
+          <w:szCs w:val="30"/>
+        </w:rPr>
+      </w:pPr>
+      <w:r>
+        <w:rPr>
+          <w:rtl w:val="0"/>
+        </w:rPr>
+      </w:r>
+    </w:p>
+    <w:p>
+      <w:pPr>
+        <w:pStyle w:val="Heading3"/>
+        <w:spacing w:after="240" w:before="360" w:lineRule="auto"/>
+        <w:rPr>
+          <w:rFonts w:ascii="Arial" w:cs="Arial" w:eastAsia="Arial" w:hAnsi="Arial"/>
+          <w:color w:val="000000"/>
+          <w:sz w:val="30"/>
+          <w:szCs w:val="30"/>
+        </w:rPr>
+      </w:pPr>
+      <w:r>
+        <w:rPr>
+          <w:rtl w:val="0"/>
+        </w:rPr>
+      </w:r>
+    </w:p>
+    <w:p>
+      <w:pPr>
+        <w:rPr/>
+      </w:pPr>
+      <w:r>
+        <w:rPr>
+          <w:rtl w:val="0"/>
+        </w:rPr>
+      </w:r>
+    </w:p>
+    <w:p>
+      <w:pPr>
+        <w:pStyle w:val="Heading3"/>
+        <w:spacing w:after="240" w:before="360" w:lineRule="auto"/>
+        <w:rPr>
+          <w:rFonts w:ascii="Arial" w:cs="Arial" w:eastAsia="Arial" w:hAnsi="Arial"/>
+          <w:color w:val="000000"/>
+          <w:sz w:val="30"/>
+          <w:szCs w:val="30"/>
+        </w:rPr>
+      </w:pPr>
       <w:r>
         <w:rPr>
           <w:rtl w:val="0"/>
@@ -3351,12 +3497,12 @@
               <wp:inline distB="0" distT="0" distL="0" distR="0">
                 <wp:extent cx="318135" cy="318135"/>
                 <wp:effectExtent b="0" l="0" r="0" t="0"/>
-                <wp:docPr descr="Output 3 — Screens + Items + Error Scenarios" id="1997424743" name="image17.png"/>
+                <wp:docPr descr="Output 3 — Screens + Items + Error Scenarios" id="1997424743" name="image23.png"/>
                 <a:graphic>
                   <a:graphicData uri="http://schemas.openxmlformats.org/drawingml/2006/picture">
                     <pic:pic>
                       <pic:nvPicPr>
-                        <pic:cNvPr descr="Output 3 — Screens + Items + Error Scenarios" id="0" name="image17.png"/>
+                        <pic:cNvPr descr="Output 3 — Screens + Items + Error Scenarios" id="0" name="image23.png"/>
                         <pic:cNvPicPr preferRelativeResize="0"/>
                       </pic:nvPicPr>
                       <pic:blipFill>
@@ -3400,14 +3546,14 @@
         </w:rPr>
         <w:drawing>
           <wp:inline distB="0" distT="0" distL="0" distR="0">
-            <wp:extent cx="6583680" cy="5005070"/>
+            <wp:extent cx="5626975" cy="4275198"/>
             <wp:effectExtent b="0" l="0" r="0" t="0"/>
-            <wp:docPr id="1997424756" name="image8.png"/>
+            <wp:docPr id="1997424759" name="image7.png"/>
             <a:graphic>
               <a:graphicData uri="http://schemas.openxmlformats.org/drawingml/2006/picture">
                 <pic:pic>
                   <pic:nvPicPr>
-                    <pic:cNvPr id="0" name="image8.png"/>
+                    <pic:cNvPr id="0" name="image7.png"/>
                     <pic:cNvPicPr preferRelativeResize="0"/>
                   </pic:nvPicPr>
                   <pic:blipFill>
@@ -3420,7 +3566,7 @@
                   <pic:spPr>
                     <a:xfrm>
                       <a:off x="0" y="0"/>
-                      <a:ext cx="6583680" cy="5005070"/>
+                      <a:ext cx="5626975" cy="4275198"/>
                     </a:xfrm>
                     <a:prstGeom prst="rect"/>
                     <a:ln/>
@@ -3453,7 +3599,10 @@
     <w:p>
       <w:pPr>
         <w:spacing w:after="240" w:line="240" w:lineRule="auto"/>
-        <w:rPr/>
+        <w:rPr>
+          <w:sz w:val="24"/>
+          <w:szCs w:val="24"/>
+        </w:rPr>
       </w:pPr>
       <w:r>
         <w:rPr>
@@ -3469,55 +3618,70 @@
         </w:rPr>
         <w:t xml:space="preserve"> Là 1 file HTML được dựng lên có thể thao tác dược từ output 3 . Đường dẫn thường sẽ là “output/prototype/index.html</w:t>
       </w:r>
-    </w:p>
-    <w:p>
-      <w:pPr>
-        <w:spacing w:after="240" w:line="240" w:lineRule="auto"/>
-        <w:rPr/>
-      </w:pPr>
-      <w:r>
-        <w:rPr>
-          <w:rtl w:val="0"/>
-        </w:rPr>
-      </w:r>
-    </w:p>
-    <w:p>
-      <w:pPr>
-        <w:spacing w:after="240" w:line="240" w:lineRule="auto"/>
-        <w:rPr/>
-      </w:pPr>
-      <w:r>
-        <w:rPr>
-          <w:rtl w:val="0"/>
-        </w:rPr>
-      </w:r>
-    </w:p>
-    <w:p>
-      <w:pPr>
-        <w:spacing w:after="240" w:line="240" w:lineRule="auto"/>
-        <w:rPr/>
-      </w:pPr>
-      <w:r>
-        <w:rPr>
-          <w:rtl w:val="0"/>
-        </w:rPr>
-      </w:r>
-    </w:p>
-    <w:p>
-      <w:pPr>
-        <w:spacing w:after="240" w:line="240" w:lineRule="auto"/>
-        <w:rPr/>
-      </w:pPr>
-      <w:r>
-        <w:rPr>
-          <w:rtl w:val="0"/>
-        </w:rPr>
-      </w:r>
-    </w:p>
-    <w:p>
-      <w:pPr>
-        <w:spacing w:after="240" w:line="240" w:lineRule="auto"/>
-        <w:rPr/>
+      <w:r>
+        <w:rPr>
+          <w:rtl w:val="0"/>
+        </w:rPr>
+      </w:r>
+    </w:p>
+    <w:p>
+      <w:pPr>
+        <w:rPr>
+          <w:sz w:val="24"/>
+          <w:szCs w:val="24"/>
+        </w:rPr>
+      </w:pPr>
+      <w:r>
+        <w:rPr>
+          <w:rtl w:val="0"/>
+        </w:rPr>
+      </w:r>
+    </w:p>
+    <w:p>
+      <w:pPr>
+        <w:rPr>
+          <w:sz w:val="24"/>
+          <w:szCs w:val="24"/>
+        </w:rPr>
+      </w:pPr>
+      <w:r>
+        <w:rPr>
+          <w:rtl w:val="0"/>
+        </w:rPr>
+      </w:r>
+    </w:p>
+    <w:p>
+      <w:pPr>
+        <w:rPr>
+          <w:sz w:val="24"/>
+          <w:szCs w:val="24"/>
+        </w:rPr>
+      </w:pPr>
+      <w:r>
+        <w:rPr>
+          <w:rtl w:val="0"/>
+        </w:rPr>
+      </w:r>
+    </w:p>
+    <w:p>
+      <w:pPr>
+        <w:rPr>
+          <w:sz w:val="24"/>
+          <w:szCs w:val="24"/>
+        </w:rPr>
+      </w:pPr>
+      <w:r>
+        <w:rPr>
+          <w:rtl w:val="0"/>
+        </w:rPr>
+      </w:r>
+    </w:p>
+    <w:p>
+      <w:pPr>
+        <w:rPr>
+          <w:sz w:val="24"/>
+          <w:szCs w:val="24"/>
+        </w:rPr>
       </w:pPr>
       <w:r>
         <w:rPr>
@@ -3528,6 +3692,8 @@
     <w:p>
       <w:pPr>
         <w:pStyle w:val="Heading3"/>
+        <w:keepNext w:val="0"/>
+        <w:keepLines w:val="0"/>
         <w:spacing w:after="240" w:before="360" w:lineRule="auto"/>
         <w:rPr>
           <w:rFonts w:ascii="Arial" w:cs="Arial" w:eastAsia="Arial" w:hAnsi="Arial"/>
@@ -3536,7 +3702,7 @@
           <w:szCs w:val="30"/>
         </w:rPr>
       </w:pPr>
-      <w:bookmarkStart w:colFirst="0" w:colLast="0" w:name="_heading=h.fsrgyj7uy34f" w:id="6"/>
+      <w:bookmarkStart w:colFirst="0" w:colLast="0" w:name="_heading=h.p6b9ankmsdcu" w:id="6"/>
       <w:bookmarkEnd w:id="6"/>
       <w:r>
         <w:rPr>
@@ -3551,7 +3717,7 @@
     </w:p>
     <w:p>
       <w:pPr>
-        <w:spacing w:after="240" w:line="240" w:lineRule="auto"/>
+        <w:spacing w:after="240" w:line="276" w:lineRule="auto"/>
         <w:rPr>
           <w:sz w:val="24"/>
           <w:szCs w:val="24"/>
@@ -3561,16 +3727,44 @@
         <w:rPr>
           <w:b w:val="1"/>
           <w:bCs w:val="1"/>
+          <w:sz w:val="24"/>
+          <w:szCs w:val="24"/>
           <w:rtl w:val="0"/>
         </w:rPr>
         <w:t xml:space="preserve">Nội dung:</w:t>
       </w:r>
       <w:r>
         <w:rPr>
-          <w:rtl w:val="0"/>
-        </w:rPr>
-        <w:t xml:space="preserve"> mỗi màn hình là một sheet riêng nhân bản từ sheet mẫu Sample, gồm metadata (Screen ID / Flow ID / Version / Status), ảnh UI bên trái, bảng item bên phải (tên item, kiểu, bắt buộc, maxlength, mô tả hành vi) . Kèm theo là sheet Screen Index để tra cứu, Screen Error message và Common mesage để quản lý message lỗi, Change History để ghi lịch sử thay đổi.</w:t>
-      </w:r>
+          <w:sz w:val="24"/>
+          <w:szCs w:val="24"/>
+          <w:rtl w:val="0"/>
+        </w:rPr>
+        <w:t xml:space="preserve"> mỗi màn hình là một sheet riêng nhân bản từ sheet mẫu Sample, gồm metadata (Screen ID / Flow ID / Version / Status), ảnh UI bên trái, bảng item bên phải (tên item, kiểu, bắt buộc, maxlength, mô tả hành vi) . Kèm theo là sheet Screen Index để tra cứu, Screen Error message và Common mesage để quản lý message lỗi, Change History để ghi lịch sử thay đổi.</w:t>
+      </w:r>
+    </w:p>
+    <w:p>
+      <w:pPr>
+        <w:rPr>
+          <w:sz w:val="24"/>
+          <w:szCs w:val="24"/>
+        </w:rPr>
+      </w:pPr>
+      <w:r>
+        <w:rPr>
+          <w:sz w:val="24"/>
+          <w:szCs w:val="24"/>
+          <w:rtl w:val="0"/>
+        </w:rPr>
+        <w:t xml:space="preserve"> </w:t>
+      </w:r>
+    </w:p>
+    <w:p>
+      <w:pPr>
+        <w:rPr>
+          <w:sz w:val="24"/>
+          <w:szCs w:val="24"/>
+        </w:rPr>
+      </w:pPr>
       <w:r>
         <w:rPr>
           <w:rtl w:val="0"/>
@@ -3593,12 +3787,12 @@
           <wp:inline distB="114300" distT="114300" distL="114300" distR="114300">
             <wp:extent cx="6583680" cy="3073400"/>
             <wp:effectExtent b="0" l="0" r="0" t="0"/>
-            <wp:docPr id="1997424744" name="image13.png"/>
+            <wp:docPr id="1997424751" name="image10.png"/>
             <a:graphic>
               <a:graphicData uri="http://schemas.openxmlformats.org/drawingml/2006/picture">
                 <pic:pic>
                   <pic:nvPicPr>
-                    <pic:cNvPr id="0" name="image13.png"/>
+                    <pic:cNvPr id="0" name="image10.png"/>
                     <pic:cNvPicPr preferRelativeResize="0"/>
                   </pic:nvPicPr>
                   <pic:blipFill>
@@ -3721,71 +3915,6 @@
     </w:p>
     <w:p>
       <w:pPr>
-        <w:rPr>
-          <w:sz w:val="24"/>
-          <w:szCs w:val="24"/>
-        </w:rPr>
-      </w:pPr>
-      <w:r>
-        <w:rPr>
-          <w:rtl w:val="0"/>
-        </w:rPr>
-      </w:r>
-    </w:p>
-    <w:p>
-      <w:pPr>
-        <w:rPr>
-          <w:sz w:val="24"/>
-          <w:szCs w:val="24"/>
-        </w:rPr>
-      </w:pPr>
-      <w:r>
-        <w:rPr>
-          <w:rtl w:val="0"/>
-        </w:rPr>
-      </w:r>
-    </w:p>
-    <w:p>
-      <w:pPr>
-        <w:rPr>
-          <w:sz w:val="24"/>
-          <w:szCs w:val="24"/>
-        </w:rPr>
-      </w:pPr>
-      <w:r>
-        <w:rPr>
-          <w:rtl w:val="0"/>
-        </w:rPr>
-      </w:r>
-    </w:p>
-    <w:p>
-      <w:pPr>
-        <w:rPr>
-          <w:sz w:val="24"/>
-          <w:szCs w:val="24"/>
-        </w:rPr>
-      </w:pPr>
-      <w:r>
-        <w:rPr>
-          <w:rtl w:val="0"/>
-        </w:rPr>
-      </w:r>
-    </w:p>
-    <w:p>
-      <w:pPr>
-        <w:rPr>
-          <w:sz w:val="24"/>
-          <w:szCs w:val="24"/>
-        </w:rPr>
-      </w:pPr>
-      <w:r>
-        <w:rPr>
-          <w:rtl w:val="0"/>
-        </w:rPr>
-      </w:r>
-    </w:p>
-    <w:p>
-      <w:pPr>
         <w:pStyle w:val="Heading1"/>
         <w:rPr/>
       </w:pPr>
@@ -3862,12 +3991,12 @@
           <wp:inline distB="114300" distT="114300" distL="114300" distR="114300">
             <wp:extent cx="6583680" cy="4851400"/>
             <wp:effectExtent b="0" l="0" r="0" t="0"/>
-            <wp:docPr id="1997424745" name="image7.png"/>
+            <wp:docPr id="1997424745" name="image6.png"/>
             <a:graphic>
               <a:graphicData uri="http://schemas.openxmlformats.org/drawingml/2006/picture">
                 <pic:pic>
                   <pic:nvPicPr>
-                    <pic:cNvPr id="0" name="image7.png"/>
+                    <pic:cNvPr id="0" name="image6.png"/>
                     <pic:cNvPicPr preferRelativeResize="0"/>
                   </pic:nvPicPr>
                   <pic:blipFill>
@@ -3952,39 +4081,6 @@
     </w:p>
     <w:p>
       <w:pPr>
-        <w:jc w:val="center"/>
-        <w:rPr>
-          <w:i w:val="1"/>
-          <w:iCs w:val="1"/>
-          <w:sz w:val="18"/>
-          <w:szCs w:val="18"/>
-        </w:rPr>
-      </w:pPr>
-      <w:r>
-        <w:rPr>
-          <w:rtl w:val="0"/>
-        </w:rPr>
-      </w:r>
-    </w:p>
-    <w:p>
-      <w:pPr>
-        <w:jc w:val="center"/>
-        <w:rPr>
-          <w:i w:val="1"/>
-          <w:iCs w:val="1"/>
-          <w:sz w:val="18"/>
-          <w:szCs w:val="18"/>
-        </w:rPr>
-      </w:pPr>
-      <w:r>
-        <w:rPr>
-          <w:rtl w:val="0"/>
-        </w:rPr>
-      </w:r>
-    </w:p>
-    <w:p>
-      <w:pPr>
-        <w:jc w:val="center"/>
         <w:rPr>
           <w:i w:val="1"/>
           <w:iCs w:val="1"/>
@@ -4059,12 +4155,12 @@
           <wp:inline distB="114300" distT="114300" distL="114300" distR="114300">
             <wp:extent cx="6583680" cy="4851400"/>
             <wp:effectExtent b="0" l="0" r="0" t="0"/>
-            <wp:docPr id="1997424757" name="image10.png"/>
+            <wp:docPr id="1997424761" name="image13.png"/>
             <a:graphic>
               <a:graphicData uri="http://schemas.openxmlformats.org/drawingml/2006/picture">
                 <pic:pic>
                   <pic:nvPicPr>
-                    <pic:cNvPr id="0" name="image10.png"/>
+                    <pic:cNvPr id="0" name="image13.png"/>
                     <pic:cNvPicPr preferRelativeResize="0"/>
                   </pic:nvPicPr>
                   <pic:blipFill>
@@ -4213,23 +4309,6 @@
     </w:p>
     <w:p>
       <w:pPr>
-        <w:jc w:val="center"/>
-        <w:rPr>
-          <w:i w:val="1"/>
-          <w:iCs w:val="1"/>
-          <w:sz w:val="18"/>
-          <w:szCs w:val="18"/>
-        </w:rPr>
-      </w:pPr>
-      <w:r>
-        <w:rPr>
-          <w:rtl w:val="0"/>
-        </w:rPr>
-      </w:r>
-    </w:p>
-    <w:p>
-      <w:pPr>
-        <w:jc w:val="center"/>
         <w:rPr>
           <w:i w:val="1"/>
           <w:iCs w:val="1"/>
@@ -4292,12 +4371,12 @@
           <wp:inline distB="114300" distT="114300" distL="114300" distR="114300">
             <wp:extent cx="6583680" cy="4851400"/>
             <wp:effectExtent b="0" l="0" r="0" t="0"/>
-            <wp:docPr id="1997424749" name="image12.png"/>
+            <wp:docPr id="1997424749" name="image4.png"/>
             <a:graphic>
               <a:graphicData uri="http://schemas.openxmlformats.org/drawingml/2006/picture">
                 <pic:pic>
                   <pic:nvPicPr>
-                    <pic:cNvPr id="0" name="image12.png"/>
+                    <pic:cNvPr id="0" name="image4.png"/>
                     <pic:cNvPicPr preferRelativeResize="0"/>
                   </pic:nvPicPr>
                   <pic:blipFill>
@@ -4410,40 +4489,1157 @@
     </w:p>
     <w:p>
       <w:pPr>
+        <w:rPr/>
+      </w:pPr>
+      <w:r>
+        <w:rPr>
+          <w:rtl w:val="0"/>
+        </w:rPr>
+      </w:r>
+    </w:p>
+    <w:p>
+      <w:pPr>
+        <w:spacing w:after="120" w:lineRule="auto"/>
+        <w:rPr/>
+      </w:pPr>
+      <w:r>
+        <w:rPr>
+          <w:rtl w:val="0"/>
+        </w:rPr>
+      </w:r>
+    </w:p>
+    <w:p>
+      <w:pPr>
+        <w:spacing w:after="120" w:lineRule="auto"/>
+        <w:rPr>
+          <w:b w:val="1"/>
+          <w:bCs w:val="1"/>
+          <w:sz w:val="24"/>
+          <w:szCs w:val="24"/>
+        </w:rPr>
+      </w:pPr>
+      <w:r>
+        <w:rPr>
+          <w:b w:val="1"/>
+          <w:bCs w:val="1"/>
+          <w:sz w:val="24"/>
+          <w:szCs w:val="24"/>
+          <w:rtl w:val="0"/>
+        </w:rPr>
+        <w:t xml:space="preserve">4. Claude phân định: đây là CR hay feedback về luồng hiện tại?</w:t>
+      </w:r>
+    </w:p>
+    <w:p>
+      <w:pPr>
+        <w:spacing w:after="120" w:lineRule="auto"/>
+        <w:rPr/>
+      </w:pPr>
+      <w:r>
+        <w:rPr>
+          <w:b w:val="1"/>
+          <w:bCs w:val="1"/>
+          <w:sz w:val="24"/>
+          <w:szCs w:val="24"/>
+        </w:rPr>
+        <w:drawing>
+          <wp:inline distB="114300" distT="114300" distL="114300" distR="114300">
+            <wp:extent cx="6773697" cy="3633740"/>
+            <wp:effectExtent b="0" l="0" r="0" t="0"/>
+            <wp:docPr id="1997424750" name="image16.png"/>
+            <a:graphic>
+              <a:graphicData uri="http://schemas.openxmlformats.org/drawingml/2006/picture">
+                <pic:pic>
+                  <pic:nvPicPr>
+                    <pic:cNvPr id="0" name="image16.png"/>
+                    <pic:cNvPicPr preferRelativeResize="0"/>
+                  </pic:nvPicPr>
+                  <pic:blipFill>
+                    <a:blip r:embed="rId22"/>
+                    <a:srcRect b="0" l="0" r="0" t="0"/>
+                    <a:stretch>
+                      <a:fillRect/>
+                    </a:stretch>
+                  </pic:blipFill>
+                  <pic:spPr>
+                    <a:xfrm>
+                      <a:off x="0" y="0"/>
+                      <a:ext cx="6773697" cy="3633740"/>
+                    </a:xfrm>
+                    <a:prstGeom prst="rect"/>
+                    <a:ln/>
+                  </pic:spPr>
+                </pic:pic>
+              </a:graphicData>
+            </a:graphic>
+          </wp:inline>
+        </w:drawing>
+      </w:r>
+      <w:r>
+        <w:rPr>
+          <w:rtl w:val="0"/>
+        </w:rPr>
+      </w:r>
+    </w:p>
+    <w:tbl>
+      <w:tblPr>
+        <w:tblStyle w:val="Table1"/>
+        <w:tblW w:w="10365.0" w:type="dxa"/>
+        <w:jc w:val="left"/>
+        <w:tblBorders>
+          <w:top w:color="000000" w:space="0" w:sz="0" w:val="nil"/>
+          <w:left w:color="000000" w:space="0" w:sz="0" w:val="nil"/>
+          <w:bottom w:color="000000" w:space="0" w:sz="0" w:val="nil"/>
+          <w:right w:color="000000" w:space="0" w:sz="0" w:val="nil"/>
+          <w:insideH w:color="000000" w:space="0" w:sz="0" w:val="nil"/>
+          <w:insideV w:color="000000" w:space="0" w:sz="0" w:val="nil"/>
+        </w:tblBorders>
+        <w:tblLayout w:type="fixed"/>
+        <w:tblLook w:val="0600"/>
+      </w:tblPr>
+      <w:tblGrid>
+        <w:gridCol w:w="1980"/>
+        <w:gridCol w:w="3150"/>
+        <w:gridCol w:w="5235"/>
+        <w:tblGridChange w:id="0">
+          <w:tblGrid>
+            <w:gridCol w:w="1980"/>
+            <w:gridCol w:w="3150"/>
+            <w:gridCol w:w="5235"/>
+          </w:tblGrid>
+        </w:tblGridChange>
+      </w:tblGrid>
+      <w:tr>
+        <w:trPr>
+          <w:cantSplit w:val="0"/>
+          <w:trHeight w:val="405" w:hRule="atLeast"/>
+          <w:tblHeader w:val="0"/>
+        </w:trPr>
+        <w:tc>
+          <w:tcPr>
+            <w:tcBorders>
+              <w:top w:color="d0d7de" w:space="0" w:sz="6" w:val="single"/>
+              <w:left w:color="d0d7de" w:space="0" w:sz="6" w:val="single"/>
+              <w:bottom w:color="d0d7de" w:space="0" w:sz="6" w:val="single"/>
+              <w:right w:color="d0d7de" w:space="0" w:sz="6" w:val="single"/>
+            </w:tcBorders>
+            <w:shd w:fill="0969da" w:val="clear"/>
+            <w:tcMar>
+              <w:top w:w="60.0" w:type="dxa"/>
+              <w:left w:w="100.0" w:type="dxa"/>
+              <w:bottom w:w="60.0" w:type="dxa"/>
+              <w:right w:w="100.0" w:type="dxa"/>
+            </w:tcMar>
+            <w:vAlign w:val="top"/>
+          </w:tcPr>
+          <w:p>
+            <w:pPr>
+              <w:spacing w:after="40" w:lineRule="auto"/>
+              <w:rPr>
+                <w:b w:val="1"/>
+                <w:bCs w:val="1"/>
+                <w:color w:val="ffffff"/>
+                <w:sz w:val="20"/>
+                <w:szCs w:val="20"/>
+              </w:rPr>
+            </w:pPr>
+            <w:r>
+              <w:rPr>
+                <w:b w:val="1"/>
+                <w:bCs w:val="1"/>
+                <w:color w:val="ffffff"/>
+                <w:sz w:val="20"/>
+                <w:szCs w:val="20"/>
+                <w:rtl w:val="0"/>
+              </w:rPr>
+              <w:t xml:space="preserve">Nhãn</w:t>
+            </w:r>
+          </w:p>
+        </w:tc>
+        <w:tc>
+          <w:tcPr>
+            <w:tcBorders>
+              <w:top w:color="d0d7de" w:space="0" w:sz="6" w:val="single"/>
+              <w:left w:color="000000" w:space="0" w:sz="0" w:val="nil"/>
+              <w:bottom w:color="d0d7de" w:space="0" w:sz="6" w:val="single"/>
+              <w:right w:color="d0d7de" w:space="0" w:sz="6" w:val="single"/>
+            </w:tcBorders>
+            <w:shd w:fill="0969da" w:val="clear"/>
+            <w:tcMar>
+              <w:top w:w="60.0" w:type="dxa"/>
+              <w:left w:w="100.0" w:type="dxa"/>
+              <w:bottom w:w="60.0" w:type="dxa"/>
+              <w:right w:w="100.0" w:type="dxa"/>
+            </w:tcMar>
+            <w:vAlign w:val="top"/>
+          </w:tcPr>
+          <w:p>
+            <w:pPr>
+              <w:spacing w:after="40" w:lineRule="auto"/>
+              <w:rPr>
+                <w:b w:val="1"/>
+                <w:bCs w:val="1"/>
+                <w:color w:val="ffffff"/>
+                <w:sz w:val="20"/>
+                <w:szCs w:val="20"/>
+              </w:rPr>
+            </w:pPr>
+            <w:r>
+              <w:rPr>
+                <w:b w:val="1"/>
+                <w:bCs w:val="1"/>
+                <w:color w:val="ffffff"/>
+                <w:sz w:val="20"/>
+                <w:szCs w:val="20"/>
+                <w:rtl w:val="0"/>
+              </w:rPr>
+              <w:t xml:space="preserve">Là gì</w:t>
+            </w:r>
+          </w:p>
+        </w:tc>
+        <w:tc>
+          <w:tcPr>
+            <w:tcBorders>
+              <w:top w:color="d0d7de" w:space="0" w:sz="6" w:val="single"/>
+              <w:left w:color="000000" w:space="0" w:sz="0" w:val="nil"/>
+              <w:bottom w:color="d0d7de" w:space="0" w:sz="6" w:val="single"/>
+              <w:right w:color="d0d7de" w:space="0" w:sz="6" w:val="single"/>
+            </w:tcBorders>
+            <w:shd w:fill="0969da" w:val="clear"/>
+            <w:tcMar>
+              <w:top w:w="60.0" w:type="dxa"/>
+              <w:left w:w="100.0" w:type="dxa"/>
+              <w:bottom w:w="60.0" w:type="dxa"/>
+              <w:right w:w="100.0" w:type="dxa"/>
+            </w:tcMar>
+            <w:vAlign w:val="top"/>
+          </w:tcPr>
+          <w:p>
+            <w:pPr>
+              <w:spacing w:after="40" w:lineRule="auto"/>
+              <w:rPr>
+                <w:b w:val="1"/>
+                <w:bCs w:val="1"/>
+                <w:color w:val="ffffff"/>
+                <w:sz w:val="20"/>
+                <w:szCs w:val="20"/>
+              </w:rPr>
+            </w:pPr>
+            <w:r>
+              <w:rPr>
+                <w:b w:val="1"/>
+                <w:bCs w:val="1"/>
+                <w:color w:val="ffffff"/>
+                <w:sz w:val="20"/>
+                <w:szCs w:val="20"/>
+                <w:rtl w:val="0"/>
+              </w:rPr>
+              <w:t xml:space="preserve">BA làm gì</w:t>
+            </w:r>
+          </w:p>
+        </w:tc>
+      </w:tr>
+      <w:tr>
+        <w:trPr>
+          <w:cantSplit w:val="0"/>
+          <w:trHeight w:val="1485" w:hRule="atLeast"/>
+          <w:tblHeader w:val="0"/>
+        </w:trPr>
+        <w:tc>
+          <w:tcPr>
+            <w:tcBorders>
+              <w:top w:color="000000" w:space="0" w:sz="0" w:val="nil"/>
+              <w:left w:color="d0d7de" w:space="0" w:sz="6" w:val="single"/>
+              <w:bottom w:color="d0d7de" w:space="0" w:sz="6" w:val="single"/>
+              <w:right w:color="d0d7de" w:space="0" w:sz="6" w:val="single"/>
+            </w:tcBorders>
+            <w:tcMar>
+              <w:top w:w="60.0" w:type="dxa"/>
+              <w:left w:w="100.0" w:type="dxa"/>
+              <w:bottom w:w="60.0" w:type="dxa"/>
+              <w:right w:w="100.0" w:type="dxa"/>
+            </w:tcMar>
+            <w:vAlign w:val="top"/>
+          </w:tcPr>
+          <w:p>
+            <w:pPr>
+              <w:spacing w:after="40" w:lineRule="auto"/>
+              <w:rPr>
+                <w:sz w:val="19"/>
+                <w:szCs w:val="19"/>
+              </w:rPr>
+            </w:pPr>
+            <w:r>
+              <w:rPr>
+                <w:sz w:val="19"/>
+                <w:szCs w:val="19"/>
+                <w:rtl w:val="0"/>
+              </w:rPr>
+              <w:t xml:space="preserve">🔴 CR</w:t>
+            </w:r>
+          </w:p>
+          <w:p>
+            <w:pPr>
+              <w:spacing w:after="40" w:lineRule="auto"/>
+              <w:rPr>
+                <w:sz w:val="19"/>
+                <w:szCs w:val="19"/>
+              </w:rPr>
+            </w:pPr>
+            <w:r>
+              <w:rPr>
+                <w:sz w:val="19"/>
+                <w:szCs w:val="19"/>
+                <w:rtl w:val="0"/>
+              </w:rPr>
+              <w:t xml:space="preserve">(ChangeRequest)</w:t>
+            </w:r>
+          </w:p>
+        </w:tc>
+        <w:tc>
+          <w:tcPr>
+            <w:tcBorders>
+              <w:top w:color="000000" w:space="0" w:sz="0" w:val="nil"/>
+              <w:left w:color="000000" w:space="0" w:sz="0" w:val="nil"/>
+              <w:bottom w:color="d0d7de" w:space="0" w:sz="6" w:val="single"/>
+              <w:right w:color="d0d7de" w:space="0" w:sz="6" w:val="single"/>
+            </w:tcBorders>
+            <w:tcMar>
+              <w:top w:w="60.0" w:type="dxa"/>
+              <w:left w:w="100.0" w:type="dxa"/>
+              <w:bottom w:w="60.0" w:type="dxa"/>
+              <w:right w:w="100.0" w:type="dxa"/>
+            </w:tcMar>
+            <w:vAlign w:val="top"/>
+          </w:tcPr>
+          <w:p>
+            <w:pPr>
+              <w:spacing w:after="40" w:lineRule="auto"/>
+              <w:rPr>
+                <w:sz w:val="19"/>
+                <w:szCs w:val="19"/>
+              </w:rPr>
+            </w:pPr>
+            <w:r>
+              <w:rPr>
+                <w:sz w:val="19"/>
+                <w:szCs w:val="19"/>
+                <w:rtl w:val="0"/>
+              </w:rPr>
+              <w:t xml:space="preserve">Ngoài scope đã chốt — thêm/bỏ màn hình, đảo quyết định đã approve, nằm trong ## Out of Scope, ảnh hưởng effort/schedule</w:t>
+            </w:r>
+          </w:p>
+        </w:tc>
+        <w:tc>
+          <w:tcPr>
+            <w:tcBorders>
+              <w:top w:color="000000" w:space="0" w:sz="0" w:val="nil"/>
+              <w:left w:color="000000" w:space="0" w:sz="0" w:val="nil"/>
+              <w:bottom w:color="d0d7de" w:space="0" w:sz="6" w:val="single"/>
+              <w:right w:color="d0d7de" w:space="0" w:sz="6" w:val="single"/>
+            </w:tcBorders>
+            <w:tcMar>
+              <w:top w:w="60.0" w:type="dxa"/>
+              <w:left w:w="100.0" w:type="dxa"/>
+              <w:bottom w:w="60.0" w:type="dxa"/>
+              <w:right w:w="100.0" w:type="dxa"/>
+            </w:tcMar>
+            <w:vAlign w:val="top"/>
+          </w:tcPr>
+          <w:p>
+            <w:pPr>
+              <w:spacing w:after="40" w:lineRule="auto"/>
+              <w:rPr>
+                <w:sz w:val="19"/>
+                <w:szCs w:val="19"/>
+              </w:rPr>
+            </w:pPr>
+            <w:r>
+              <w:rPr>
+                <w:sz w:val="19"/>
+                <w:szCs w:val="19"/>
+                <w:rtl w:val="0"/>
+              </w:rPr>
+              <w:t xml:space="preserve">① in giải trình vì sao đây là CR kèm trích dẫn baseline → ② hỏi lại bạn (AskUserQuestion) → ③ vẽ CR view MỚI (không vẽ chồng Output 1/2/3), mỗi node có badge 🟩 NEW / 🟨 UPD / 🟥 DEL / ⬜ AS-IS + bảng CR Change Table → ④ tạo output_cr.md (tài liệu trao đổi KH, ≤ 1 trang, gạch đầu dòng + reference file) → ⑤ snapshot v&lt;N+1&gt;</w:t>
+            </w:r>
+          </w:p>
+        </w:tc>
+      </w:tr>
+      <w:tr>
+        <w:trPr>
+          <w:cantSplit w:val="0"/>
+          <w:trHeight w:val="1050" w:hRule="atLeast"/>
+          <w:tblHeader w:val="0"/>
+        </w:trPr>
+        <w:tc>
+          <w:tcPr>
+            <w:tcBorders>
+              <w:top w:color="000000" w:space="0" w:sz="0" w:val="nil"/>
+              <w:left w:color="d0d7de" w:space="0" w:sz="6" w:val="single"/>
+              <w:bottom w:color="d0d7de" w:space="0" w:sz="6" w:val="single"/>
+              <w:right w:color="d0d7de" w:space="0" w:sz="6" w:val="single"/>
+            </w:tcBorders>
+            <w:shd w:fill="f6f8fa" w:val="clear"/>
+            <w:tcMar>
+              <w:top w:w="60.0" w:type="dxa"/>
+              <w:left w:w="100.0" w:type="dxa"/>
+              <w:bottom w:w="60.0" w:type="dxa"/>
+              <w:right w:w="100.0" w:type="dxa"/>
+            </w:tcMar>
+            <w:vAlign w:val="top"/>
+          </w:tcPr>
+          <w:p>
+            <w:pPr>
+              <w:spacing w:after="40" w:lineRule="auto"/>
+              <w:rPr>
+                <w:sz w:val="19"/>
+                <w:szCs w:val="19"/>
+              </w:rPr>
+            </w:pPr>
+            <w:r>
+              <w:rPr>
+                <w:sz w:val="19"/>
+                <w:szCs w:val="19"/>
+                <w:rtl w:val="0"/>
+              </w:rPr>
+              <w:t xml:space="preserve">🟡 FEEDBACK</w:t>
+            </w:r>
+          </w:p>
+        </w:tc>
+        <w:tc>
+          <w:tcPr>
+            <w:tcBorders>
+              <w:top w:color="000000" w:space="0" w:sz="0" w:val="nil"/>
+              <w:left w:color="000000" w:space="0" w:sz="0" w:val="nil"/>
+              <w:bottom w:color="d0d7de" w:space="0" w:sz="6" w:val="single"/>
+              <w:right w:color="d0d7de" w:space="0" w:sz="6" w:val="single"/>
+            </w:tcBorders>
+            <w:shd w:fill="f6f8fa" w:val="clear"/>
+            <w:tcMar>
+              <w:top w:w="60.0" w:type="dxa"/>
+              <w:left w:w="100.0" w:type="dxa"/>
+              <w:bottom w:w="60.0" w:type="dxa"/>
+              <w:right w:w="100.0" w:type="dxa"/>
+            </w:tcMar>
+            <w:vAlign w:val="top"/>
+          </w:tcPr>
+          <w:p>
+            <w:pPr>
+              <w:spacing w:after="40" w:lineRule="auto"/>
+              <w:rPr>
+                <w:sz w:val="19"/>
+                <w:szCs w:val="19"/>
+              </w:rPr>
+            </w:pPr>
+            <w:r>
+              <w:rPr>
+                <w:sz w:val="19"/>
+                <w:szCs w:val="19"/>
+                <w:rtl w:val="0"/>
+              </w:rPr>
+              <w:t xml:space="preserve">Trong scope — BA vẽ sai/thiếu so với requirement gốc, chốt Open Question, wording/layout/typo, chi tiết hóa item đã có</w:t>
+            </w:r>
+          </w:p>
+        </w:tc>
+        <w:tc>
+          <w:tcPr>
+            <w:tcBorders>
+              <w:top w:color="000000" w:space="0" w:sz="0" w:val="nil"/>
+              <w:left w:color="000000" w:space="0" w:sz="0" w:val="nil"/>
+              <w:bottom w:color="d0d7de" w:space="0" w:sz="6" w:val="single"/>
+              <w:right w:color="d0d7de" w:space="0" w:sz="6" w:val="single"/>
+            </w:tcBorders>
+            <w:shd w:fill="f6f8fa" w:val="clear"/>
+            <w:tcMar>
+              <w:top w:w="60.0" w:type="dxa"/>
+              <w:left w:w="100.0" w:type="dxa"/>
+              <w:bottom w:w="60.0" w:type="dxa"/>
+              <w:right w:w="100.0" w:type="dxa"/>
+            </w:tcMar>
+            <w:vAlign w:val="top"/>
+          </w:tcPr>
+          <w:p>
+            <w:pPr>
+              <w:spacing w:after="40" w:lineRule="auto"/>
+              <w:rPr>
+                <w:sz w:val="19"/>
+                <w:szCs w:val="19"/>
+              </w:rPr>
+            </w:pPr>
+            <w:sdt>
+              <w:sdtPr>
+                <w:id w:val="-652390027"/>
+                <w:tag w:val="goog_rdk_5"/>
+              </w:sdtPr>
+              <w:sdtContent>
+                <w:r>
+                  <w:rPr>
+                    <w:rFonts w:ascii="Arial Unicode MS" w:cs="Arial Unicode MS" w:eastAsia="Arial Unicode MS" w:hAnsi="Arial Unicode MS"/>
+                    <w:sz w:val="19"/>
+                    <w:szCs w:val="19"/>
+                    <w:rtl w:val="0"/>
+                  </w:rPr>
+                  <w:t xml:space="preserve">① bảng Impact Analysis → ② hỏi lại bạn scope update (AskUserQuestion) → ③ scoped update (chỉ sửa phần liên quan, không regenerate toàn bộ) → ④ snapshot v&lt;N+1&gt;</w:t>
+                </w:r>
+              </w:sdtContent>
+            </w:sdt>
+          </w:p>
+        </w:tc>
+      </w:tr>
+      <w:tr>
+        <w:trPr>
+          <w:cantSplit w:val="0"/>
+          <w:trHeight w:val="615" w:hRule="atLeast"/>
+          <w:tblHeader w:val="0"/>
+        </w:trPr>
+        <w:tc>
+          <w:tcPr>
+            <w:tcBorders>
+              <w:top w:color="000000" w:space="0" w:sz="0" w:val="nil"/>
+              <w:left w:color="d0d7de" w:space="0" w:sz="6" w:val="single"/>
+              <w:bottom w:color="d0d7de" w:space="0" w:sz="6" w:val="single"/>
+              <w:right w:color="d0d7de" w:space="0" w:sz="6" w:val="single"/>
+            </w:tcBorders>
+            <w:tcMar>
+              <w:top w:w="60.0" w:type="dxa"/>
+              <w:left w:w="100.0" w:type="dxa"/>
+              <w:bottom w:w="60.0" w:type="dxa"/>
+              <w:right w:w="100.0" w:type="dxa"/>
+            </w:tcMar>
+            <w:vAlign w:val="top"/>
+          </w:tcPr>
+          <w:p>
+            <w:pPr>
+              <w:spacing w:after="40" w:lineRule="auto"/>
+              <w:rPr>
+                <w:sz w:val="19"/>
+                <w:szCs w:val="19"/>
+              </w:rPr>
+            </w:pPr>
+            <w:r>
+              <w:rPr>
+                <w:sz w:val="19"/>
+                <w:szCs w:val="19"/>
+                <w:rtl w:val="0"/>
+              </w:rPr>
+              <w:t xml:space="preserve">⚪ CHƯA RÕ</w:t>
+            </w:r>
+          </w:p>
+        </w:tc>
+        <w:tc>
+          <w:tcPr>
+            <w:tcBorders>
+              <w:top w:color="000000" w:space="0" w:sz="0" w:val="nil"/>
+              <w:left w:color="000000" w:space="0" w:sz="0" w:val="nil"/>
+              <w:bottom w:color="d0d7de" w:space="0" w:sz="6" w:val="single"/>
+              <w:right w:color="d0d7de" w:space="0" w:sz="6" w:val="single"/>
+            </w:tcBorders>
+            <w:tcMar>
+              <w:top w:w="60.0" w:type="dxa"/>
+              <w:left w:w="100.0" w:type="dxa"/>
+              <w:bottom w:w="60.0" w:type="dxa"/>
+              <w:right w:w="100.0" w:type="dxa"/>
+            </w:tcMar>
+            <w:vAlign w:val="top"/>
+          </w:tcPr>
+          <w:p>
+            <w:pPr>
+              <w:spacing w:after="40" w:lineRule="auto"/>
+              <w:rPr>
+                <w:sz w:val="19"/>
+                <w:szCs w:val="19"/>
+              </w:rPr>
+            </w:pPr>
+            <w:r>
+              <w:rPr>
+                <w:sz w:val="19"/>
+                <w:szCs w:val="19"/>
+                <w:rtl w:val="0"/>
+              </w:rPr>
+              <w:t xml:space="preserve">Không trích được bằng chứng từ baseline</w:t>
+            </w:r>
+          </w:p>
+        </w:tc>
+        <w:tc>
+          <w:tcPr>
+            <w:tcBorders>
+              <w:top w:color="000000" w:space="0" w:sz="0" w:val="nil"/>
+              <w:left w:color="000000" w:space="0" w:sz="0" w:val="nil"/>
+              <w:bottom w:color="d0d7de" w:space="0" w:sz="6" w:val="single"/>
+              <w:right w:color="d0d7de" w:space="0" w:sz="6" w:val="single"/>
+            </w:tcBorders>
+            <w:tcMar>
+              <w:top w:w="60.0" w:type="dxa"/>
+              <w:left w:w="100.0" w:type="dxa"/>
+              <w:bottom w:w="60.0" w:type="dxa"/>
+              <w:right w:w="100.0" w:type="dxa"/>
+            </w:tcMar>
+            <w:vAlign w:val="top"/>
+          </w:tcPr>
+          <w:p>
+            <w:pPr>
+              <w:spacing w:after="40" w:lineRule="auto"/>
+              <w:rPr>
+                <w:sz w:val="19"/>
+                <w:szCs w:val="19"/>
+              </w:rPr>
+            </w:pPr>
+            <w:r>
+              <w:rPr>
+                <w:sz w:val="19"/>
+                <w:szCs w:val="19"/>
+                <w:rtl w:val="0"/>
+              </w:rPr>
+              <w:t xml:space="preserve">Hỏi lại bạn, không tự chọn nhánh</w:t>
+            </w:r>
+          </w:p>
+        </w:tc>
+      </w:tr>
+    </w:tbl>
+    <w:p>
+      <w:pPr>
+        <w:rPr/>
+      </w:pPr>
+      <w:r>
+        <w:rPr>
+          <w:rtl w:val="0"/>
+        </w:rPr>
+      </w:r>
+    </w:p>
+    <w:p>
+      <w:pPr>
+        <w:rPr/>
+      </w:pPr>
+      <w:r>
+        <w:rPr>
+          <w:rtl w:val="0"/>
+        </w:rPr>
+      </w:r>
+    </w:p>
+    <w:p>
+      <w:pPr>
+        <w:rPr/>
+      </w:pPr>
+      <w:r>
+        <w:rPr>
+          <w:rtl w:val="0"/>
+        </w:rPr>
+      </w:r>
+    </w:p>
+    <w:p>
+      <w:pPr>
+        <w:rPr/>
+      </w:pPr>
+      <w:r>
+        <w:rPr>
+          <w:rtl w:val="0"/>
+        </w:rPr>
+      </w:r>
+    </w:p>
+    <w:p>
+      <w:pPr>
+        <w:rPr/>
+      </w:pPr>
+      <w:r>
+        <w:rPr>
+          <w:rtl w:val="0"/>
+        </w:rPr>
+      </w:r>
+    </w:p>
+    <w:p>
+      <w:pPr>
+        <w:spacing w:after="80" w:lineRule="auto"/>
+        <w:rPr>
+          <w:b w:val="1"/>
+          <w:bCs w:val="1"/>
+          <w:sz w:val="24"/>
+          <w:szCs w:val="24"/>
+        </w:rPr>
+      </w:pPr>
+      <w:r>
+        <w:rPr>
+          <w:rtl w:val="0"/>
+        </w:rPr>
+      </w:r>
+    </w:p>
+    <w:p>
+      <w:pPr>
+        <w:spacing w:after="80" w:lineRule="auto"/>
+        <w:rPr>
+          <w:b w:val="1"/>
+          <w:bCs w:val="1"/>
+          <w:sz w:val="24"/>
+          <w:szCs w:val="24"/>
+        </w:rPr>
+      </w:pPr>
+      <w:r>
+        <w:rPr>
+          <w:b w:val="1"/>
+          <w:bCs w:val="1"/>
+          <w:sz w:val="24"/>
+          <w:szCs w:val="24"/>
+          <w:rtl w:val="0"/>
+        </w:rPr>
+        <w:t xml:space="preserve">5. Khi là CR — Claude tạo thêm 2 output riêng</w:t>
+      </w:r>
+    </w:p>
+    <w:p>
+      <w:pPr>
+        <w:spacing w:after="120" w:lineRule="auto"/>
+        <w:rPr/>
+      </w:pPr>
+      <w:r>
+        <w:rPr>
+          <w:rtl w:val="0"/>
+        </w:rPr>
+        <w:t xml:space="preserve">CR không được vẽ chồng vào Output 1/2/3 đã giao. Claude vẽ một view riêng, trong đó mỗi node đều chỉ rõ chỗ nào tạo mới, chỗ nào sửa cái cũ:</w:t>
+      </w:r>
+    </w:p>
+    <w:p>
+      <w:pPr>
+        <w:rPr/>
+      </w:pPr>
+      <w:r>
+        <w:rPr>
+          <w:rtl w:val="0"/>
+        </w:rPr>
+      </w:r>
+    </w:p>
+    <w:tbl>
+      <w:tblPr>
+        <w:tblStyle w:val="Table2"/>
+        <w:tblW w:w="10350.0" w:type="dxa"/>
+        <w:jc w:val="left"/>
+        <w:tblBorders>
+          <w:top w:color="000000" w:space="0" w:sz="0" w:val="nil"/>
+          <w:left w:color="000000" w:space="0" w:sz="0" w:val="nil"/>
+          <w:bottom w:color="000000" w:space="0" w:sz="0" w:val="nil"/>
+          <w:right w:color="000000" w:space="0" w:sz="0" w:val="nil"/>
+          <w:insideH w:color="000000" w:space="0" w:sz="0" w:val="nil"/>
+          <w:insideV w:color="000000" w:space="0" w:sz="0" w:val="nil"/>
+        </w:tblBorders>
+        <w:tblLayout w:type="fixed"/>
+        <w:tblLook w:val="0600"/>
+      </w:tblPr>
+      <w:tblGrid>
+        <w:gridCol w:w="2310"/>
+        <w:gridCol w:w="3015"/>
+        <w:gridCol w:w="5025"/>
+        <w:tblGridChange w:id="0">
+          <w:tblGrid>
+            <w:gridCol w:w="2310"/>
+            <w:gridCol w:w="3015"/>
+            <w:gridCol w:w="5025"/>
+          </w:tblGrid>
+        </w:tblGridChange>
+      </w:tblGrid>
+      <w:tr>
+        <w:trPr>
+          <w:cantSplit w:val="0"/>
+          <w:trHeight w:val="405" w:hRule="atLeast"/>
+          <w:tblHeader w:val="0"/>
+        </w:trPr>
+        <w:tc>
+          <w:tcPr>
+            <w:tcBorders>
+              <w:top w:color="d0d7de" w:space="0" w:sz="6" w:val="single"/>
+              <w:left w:color="d0d7de" w:space="0" w:sz="6" w:val="single"/>
+              <w:bottom w:color="d0d7de" w:space="0" w:sz="6" w:val="single"/>
+              <w:right w:color="d0d7de" w:space="0" w:sz="6" w:val="single"/>
+            </w:tcBorders>
+            <w:shd w:fill="0969da" w:val="clear"/>
+            <w:tcMar>
+              <w:top w:w="60.0" w:type="dxa"/>
+              <w:left w:w="100.0" w:type="dxa"/>
+              <w:bottom w:w="60.0" w:type="dxa"/>
+              <w:right w:w="100.0" w:type="dxa"/>
+            </w:tcMar>
+            <w:vAlign w:val="top"/>
+          </w:tcPr>
+          <w:p>
+            <w:pPr>
+              <w:spacing w:after="40" w:lineRule="auto"/>
+              <w:rPr>
+                <w:b w:val="1"/>
+                <w:bCs w:val="1"/>
+                <w:color w:val="ffffff"/>
+                <w:sz w:val="20"/>
+                <w:szCs w:val="20"/>
+              </w:rPr>
+            </w:pPr>
+            <w:r>
+              <w:rPr>
+                <w:b w:val="1"/>
+                <w:bCs w:val="1"/>
+                <w:color w:val="ffffff"/>
+                <w:sz w:val="20"/>
+                <w:szCs w:val="20"/>
+                <w:rtl w:val="0"/>
+              </w:rPr>
+              <w:t xml:space="preserve">Output</w:t>
+            </w:r>
+          </w:p>
+        </w:tc>
+        <w:tc>
+          <w:tcPr>
+            <w:tcBorders>
+              <w:top w:color="d0d7de" w:space="0" w:sz="6" w:val="single"/>
+              <w:left w:color="000000" w:space="0" w:sz="0" w:val="nil"/>
+              <w:bottom w:color="d0d7de" w:space="0" w:sz="6" w:val="single"/>
+              <w:right w:color="d0d7de" w:space="0" w:sz="6" w:val="single"/>
+            </w:tcBorders>
+            <w:shd w:fill="0969da" w:val="clear"/>
+            <w:tcMar>
+              <w:top w:w="60.0" w:type="dxa"/>
+              <w:left w:w="100.0" w:type="dxa"/>
+              <w:bottom w:w="60.0" w:type="dxa"/>
+              <w:right w:w="100.0" w:type="dxa"/>
+            </w:tcMar>
+            <w:vAlign w:val="top"/>
+          </w:tcPr>
+          <w:p>
+            <w:pPr>
+              <w:spacing w:after="40" w:lineRule="auto"/>
+              <w:rPr>
+                <w:b w:val="1"/>
+                <w:bCs w:val="1"/>
+                <w:color w:val="ffffff"/>
+                <w:sz w:val="20"/>
+                <w:szCs w:val="20"/>
+              </w:rPr>
+            </w:pPr>
+            <w:r>
+              <w:rPr>
+                <w:b w:val="1"/>
+                <w:bCs w:val="1"/>
+                <w:color w:val="ffffff"/>
+                <w:sz w:val="20"/>
+                <w:szCs w:val="20"/>
+                <w:rtl w:val="0"/>
+              </w:rPr>
+              <w:t xml:space="preserve">Nội dung chính</w:t>
+            </w:r>
+          </w:p>
+        </w:tc>
+        <w:tc>
+          <w:tcPr>
+            <w:tcBorders>
+              <w:top w:color="d0d7de" w:space="0" w:sz="6" w:val="single"/>
+              <w:left w:color="000000" w:space="0" w:sz="0" w:val="nil"/>
+              <w:bottom w:color="d0d7de" w:space="0" w:sz="6" w:val="single"/>
+              <w:right w:color="d0d7de" w:space="0" w:sz="6" w:val="single"/>
+            </w:tcBorders>
+            <w:shd w:fill="0969da" w:val="clear"/>
+            <w:tcMar>
+              <w:top w:w="60.0" w:type="dxa"/>
+              <w:left w:w="100.0" w:type="dxa"/>
+              <w:bottom w:w="60.0" w:type="dxa"/>
+              <w:right w:w="100.0" w:type="dxa"/>
+            </w:tcMar>
+            <w:vAlign w:val="top"/>
+          </w:tcPr>
+          <w:p>
+            <w:pPr>
+              <w:spacing w:after="40" w:lineRule="auto"/>
+              <w:rPr>
+                <w:b w:val="1"/>
+                <w:bCs w:val="1"/>
+                <w:color w:val="ffffff"/>
+                <w:sz w:val="20"/>
+                <w:szCs w:val="20"/>
+              </w:rPr>
+            </w:pPr>
+            <w:r>
+              <w:rPr>
+                <w:b w:val="1"/>
+                <w:bCs w:val="1"/>
+                <w:color w:val="ffffff"/>
+                <w:sz w:val="20"/>
+                <w:szCs w:val="20"/>
+                <w:rtl w:val="0"/>
+              </w:rPr>
+              <w:t xml:space="preserve">Format / Nơi lưu</w:t>
+            </w:r>
+          </w:p>
+        </w:tc>
+      </w:tr>
+      <w:tr>
+        <w:trPr>
+          <w:cantSplit w:val="0"/>
+          <w:trHeight w:val="1485" w:hRule="atLeast"/>
+          <w:tblHeader w:val="0"/>
+        </w:trPr>
+        <w:tc>
+          <w:tcPr>
+            <w:tcBorders>
+              <w:top w:color="000000" w:space="0" w:sz="0" w:val="nil"/>
+              <w:left w:color="d0d7de" w:space="0" w:sz="6" w:val="single"/>
+              <w:bottom w:color="d0d7de" w:space="0" w:sz="6" w:val="single"/>
+              <w:right w:color="d0d7de" w:space="0" w:sz="6" w:val="single"/>
+            </w:tcBorders>
+            <w:tcMar>
+              <w:top w:w="60.0" w:type="dxa"/>
+              <w:left w:w="100.0" w:type="dxa"/>
+              <w:bottom w:w="60.0" w:type="dxa"/>
+              <w:right w:w="100.0" w:type="dxa"/>
+            </w:tcMar>
+            <w:vAlign w:val="top"/>
+          </w:tcPr>
+          <w:p>
+            <w:pPr>
+              <w:spacing w:after="40" w:lineRule="auto"/>
+              <w:rPr>
+                <w:sz w:val="19"/>
+                <w:szCs w:val="19"/>
+              </w:rPr>
+            </w:pPr>
+            <w:r>
+              <w:rPr>
+                <w:sz w:val="19"/>
+                <w:szCs w:val="19"/>
+                <w:rtl w:val="0"/>
+              </w:rPr>
+              <w:t xml:space="preserve">CR view + output_cr.md</w:t>
+            </w:r>
+          </w:p>
+          <w:p>
+            <w:pPr>
+              <w:spacing w:after="40" w:lineRule="auto"/>
+              <w:rPr>
+                <w:sz w:val="19"/>
+                <w:szCs w:val="19"/>
+              </w:rPr>
+            </w:pPr>
+            <w:r>
+              <w:rPr>
+                <w:sz w:val="19"/>
+                <w:szCs w:val="19"/>
+                <w:rtl w:val="0"/>
+              </w:rPr>
+              <w:t xml:space="preserve">🔴 chỉ khi feedback được phân loại là ChangeRequest</w:t>
+            </w:r>
+          </w:p>
+        </w:tc>
+        <w:tc>
+          <w:tcPr>
+            <w:tcBorders>
+              <w:top w:color="000000" w:space="0" w:sz="0" w:val="nil"/>
+              <w:left w:color="000000" w:space="0" w:sz="0" w:val="nil"/>
+              <w:bottom w:color="d0d7de" w:space="0" w:sz="6" w:val="single"/>
+              <w:right w:color="d0d7de" w:space="0" w:sz="6" w:val="single"/>
+            </w:tcBorders>
+            <w:tcMar>
+              <w:top w:w="60.0" w:type="dxa"/>
+              <w:left w:w="100.0" w:type="dxa"/>
+              <w:bottom w:w="60.0" w:type="dxa"/>
+              <w:right w:w="100.0" w:type="dxa"/>
+            </w:tcMar>
+            <w:vAlign w:val="top"/>
+          </w:tcPr>
+          <w:p>
+            <w:pPr>
+              <w:spacing w:after="40" w:lineRule="auto"/>
+              <w:rPr>
+                <w:sz w:val="19"/>
+                <w:szCs w:val="19"/>
+              </w:rPr>
+            </w:pPr>
+            <w:r>
+              <w:rPr>
+                <w:sz w:val="19"/>
+                <w:szCs w:val="19"/>
+                <w:rtl w:val="0"/>
+              </w:rPr>
+              <w:t xml:space="preserve">Figma view RIÊNG cho CR (badge NEW / UPD / DEL / AS-IS + CR Change Table) + tài liệu trao đổi KH “vì sao đây là CR” (ngắn gọn, gạch đầu dòng, reference file)</w:t>
+            </w:r>
+          </w:p>
+        </w:tc>
+        <w:tc>
+          <w:tcPr>
+            <w:tcBorders>
+              <w:top w:color="000000" w:space="0" w:sz="0" w:val="nil"/>
+              <w:left w:color="000000" w:space="0" w:sz="0" w:val="nil"/>
+              <w:bottom w:color="d0d7de" w:space="0" w:sz="6" w:val="single"/>
+              <w:right w:color="d0d7de" w:space="0" w:sz="6" w:val="single"/>
+            </w:tcBorders>
+            <w:tcMar>
+              <w:top w:w="60.0" w:type="dxa"/>
+              <w:left w:w="100.0" w:type="dxa"/>
+              <w:bottom w:w="60.0" w:type="dxa"/>
+              <w:right w:w="100.0" w:type="dxa"/>
+            </w:tcMar>
+            <w:vAlign w:val="top"/>
+          </w:tcPr>
+          <w:p>
+            <w:pPr>
+              <w:spacing w:after="40" w:lineRule="auto"/>
+              <w:rPr>
+                <w:sz w:val="19"/>
+                <w:szCs w:val="19"/>
+              </w:rPr>
+            </w:pPr>
+            <w:r>
+              <w:rPr>
+                <w:sz w:val="19"/>
+                <w:szCs w:val="19"/>
+                <w:rtl w:val="0"/>
+              </w:rPr>
+              <w:t xml:space="preserve">Figma node mới + &lt;output&gt;/versions/v&lt;N+1&gt;_&lt;DDMMYYYY&gt;/output_cr.md</w:t>
+            </w:r>
+          </w:p>
+        </w:tc>
+      </w:tr>
+    </w:tbl>
+    <w:p>
+      <w:pPr>
+        <w:spacing w:after="120" w:lineRule="auto"/>
+        <w:rPr/>
+      </w:pPr>
+      <w:r>
+        <w:rPr>
+          <w:rtl w:val="0"/>
+        </w:rPr>
+      </w:r>
+    </w:p>
+    <w:p>
+      <w:pPr>
+        <w:rPr/>
+      </w:pPr>
+      <w:r>
+        <w:rPr/>
+        <w:drawing>
+          <wp:inline distB="114300" distT="114300" distL="114300" distR="114300">
+            <wp:extent cx="6583680" cy="3556000"/>
+            <wp:effectExtent b="0" l="0" r="0" t="0"/>
+            <wp:docPr id="1997424744" name="image17.png"/>
+            <a:graphic>
+              <a:graphicData uri="http://schemas.openxmlformats.org/drawingml/2006/picture">
+                <pic:pic>
+                  <pic:nvPicPr>
+                    <pic:cNvPr id="0" name="image17.png"/>
+                    <pic:cNvPicPr preferRelativeResize="0"/>
+                  </pic:nvPicPr>
+                  <pic:blipFill>
+                    <a:blip r:embed="rId23"/>
+                    <a:srcRect b="0" l="0" r="0" t="0"/>
+                    <a:stretch>
+                      <a:fillRect/>
+                    </a:stretch>
+                  </pic:blipFill>
+                  <pic:spPr>
+                    <a:xfrm>
+                      <a:off x="0" y="0"/>
+                      <a:ext cx="6583680" cy="3556000"/>
+                    </a:xfrm>
+                    <a:prstGeom prst="rect"/>
+                    <a:ln/>
+                  </pic:spPr>
+                </pic:pic>
+              </a:graphicData>
+            </a:graphic>
+          </wp:inline>
+        </w:drawing>
+      </w:r>
+      <w:r>
+        <w:rPr>
+          <w:b w:val="1"/>
+          <w:bCs w:val="1"/>
+          <w:rtl w:val="0"/>
+        </w:rPr>
+        <w:t xml:space="preserve">Lưu ý: </w:t>
+      </w:r>
+      <w:r>
+        <w:rPr>
+          <w:rtl w:val="0"/>
+        </w:rPr>
+        <w:t xml:space="preserve">output_cr.md là tài liệu gửi khách hàng — Claude viết ngắn gọn (≤ 1 trang), mỗi lý do 1 gạch đầu dòng kèm trích dẫn baseline, không đưa man-day / giá, không ghi họ tên thật. CR chưa được KH chốt thì chưa được đưa vào Happy Path / Acceptance Criteria của SPEC.</w:t>
+      </w:r>
+    </w:p>
+    <w:p>
+      <w:pPr>
+        <w:rPr/>
+      </w:pPr>
+      <w:r>
+        <w:rPr>
+          <w:rtl w:val="0"/>
+        </w:rPr>
+      </w:r>
+    </w:p>
+    <w:p>
+      <w:pPr>
+        <w:rPr/>
+      </w:pPr>
+      <w:r>
+        <w:rPr>
+          <w:rtl w:val="0"/>
+        </w:rPr>
+      </w:r>
+    </w:p>
+    <w:p>
+      <w:pPr>
         <w:pStyle w:val="Heading1"/>
+        <w:rPr>
+          <w:rFonts w:ascii="Roboto Mono" w:cs="Roboto Mono" w:eastAsia="Roboto Mono" w:hAnsi="Roboto Mono"/>
+          <w:color w:val="188038"/>
+        </w:rPr>
+      </w:pPr>
+      <w:bookmarkStart w:colFirst="0" w:colLast="0" w:name="_heading=h.iymlfyhn2wxr" w:id="8"/>
+      <w:bookmarkEnd w:id="8"/>
+      <w:r>
         <w:rPr>
           <w:sz w:val="32"/>
           <w:szCs w:val="32"/>
-        </w:rPr>
-      </w:pPr>
-      <w:bookmarkStart w:colFirst="0" w:colLast="0" w:name="_heading=h.iymlfyhn2wxr" w:id="8"/>
-      <w:bookmarkEnd w:id="8"/>
-      <w:r>
-        <w:rPr>
-          <w:sz w:val="32"/>
-          <w:szCs w:val="32"/>
-          <w:rtl w:val="0"/>
-        </w:rPr>
-        <w:t xml:space="preserve">MỘT SỐ LỖI KHI DÙNG </w:t>
+          <w:rtl w:val="0"/>
+        </w:rPr>
+        <w:t xml:space="preserve">SETUP TRƯỚC KHI RUN BA KIT </w:t>
+      </w:r>
+      <w:r>
+        <w:rPr>
+          <w:rtl w:val="0"/>
+        </w:rPr>
       </w:r>
     </w:p>
     <w:p>
       <w:pPr>
         <w:pStyle w:val="Heading3"/>
+        <w:rPr>
+          <w:rFonts w:ascii="Arial" w:cs="Arial" w:eastAsia="Arial" w:hAnsi="Arial"/>
+          <w:color w:val="000000"/>
+          <w:sz w:val="34"/>
+          <w:szCs w:val="34"/>
+        </w:rPr>
+      </w:pPr>
+      <w:bookmarkStart w:colFirst="0" w:colLast="0" w:name="_heading=h.5xxdx5umupd4" w:id="9"/>
+      <w:bookmarkEnd w:id="9"/>
+      <w:r>
         <w:rPr>
           <w:sz w:val="29"/>
           <w:szCs w:val="29"/>
-        </w:rPr>
-      </w:pPr>
-      <w:bookmarkStart w:colFirst="0" w:colLast="0" w:name="_heading=h.lfp8lzoyj59c" w:id="9"/>
-      <w:bookmarkEnd w:id="9"/>
-      <w:r>
-        <w:rPr>
-          <w:sz w:val="29"/>
-          <w:szCs w:val="29"/>
-          <w:rtl w:val="0"/>
-        </w:rPr>
-        <w:t xml:space="preserve">1- Kết nối với FIGMA </w:t>
+          <w:rtl w:val="0"/>
+        </w:rPr>
+        <w:t xml:space="preserve">1 - Thiết lập Claude Code trên VS Code</w:t>
+      </w:r>
+      <w:r>
+        <w:rPr>
+          <w:rtl w:val="0"/>
+        </w:rPr>
+      </w:r>
+    </w:p>
+    <w:p>
+      <w:pPr>
+        <w:rPr/>
+      </w:pPr>
+      <w:r>
+        <w:rPr>
+          <w:b w:val="1"/>
+          <w:bCs w:val="1"/>
+          <w:rtl w:val="0"/>
+        </w:rPr>
+        <w:t xml:space="preserve">※ Yêu cầu:</w:t>
+      </w:r>
+      <w:r>
+        <w:rPr>
+          <w:rtl w:val="0"/>
+        </w:rPr>
       </w:r>
     </w:p>
     <w:p>
@@ -4452,17 +5648,45 @@
           <w:ilvl w:val="0"/>
           <w:numId w:val="2"/>
         </w:numPr>
-        <w:spacing w:after="0" w:afterAutospacing="0"/>
+        <w:spacing w:after="0" w:afterAutospacing="0" w:before="240" w:lineRule="auto"/>
         <w:ind w:left="720" w:hanging="360"/>
-        <w:rPr>
-          <w:u w:val="none"/>
-        </w:rPr>
-      </w:pPr>
-      <w:r>
-        <w:rPr>
-          <w:rtl w:val="0"/>
-        </w:rPr>
-        <w:t xml:space="preserve">Yêu cầu phải dùng FIGMA của công ty cấp - liên hệ bộ phận QA để lấy thông tin tài khoản </w:t>
+      </w:pPr>
+      <w:r>
+        <w:rPr>
+          <w:rtl w:val="0"/>
+        </w:rPr>
+        <w:t xml:space="preserve">Đã cài đặt </w:t>
+      </w:r>
+      <w:sdt>
+        <w:sdtPr>
+          <w:id w:val="1474026806"/>
+          <w:tag w:val="goog_rdk_6"/>
+        </w:sdtPr>
+        <w:sdtContent>
+          <w:r>
+            <w:rPr>
+              <w:rFonts w:ascii="Arial Unicode MS" w:cs="Arial Unicode MS" w:eastAsia="Arial Unicode MS" w:hAnsi="Arial Unicode MS"/>
+              <w:rtl w:val="0"/>
+            </w:rPr>
+            <w:t xml:space="preserve">VS Code 1.94.0 trở lên (kiểm tra: Help → About). Download VS Code tại </w:t>
+          </w:r>
+        </w:sdtContent>
+      </w:sdt>
+      <w:hyperlink r:id="rId24">
+        <w:r>
+          <w:rPr>
+            <w:color w:val="1155cc"/>
+            <w:u w:val="single"/>
+            <w:rtl w:val="0"/>
+          </w:rPr>
+          <w:t xml:space="preserve">đây</w:t>
+        </w:r>
+      </w:hyperlink>
+      <w:r>
+        <w:rPr>
+          <w:rtl w:val="0"/>
+        </w:rPr>
+        <w:t xml:space="preserve"> và install trường hợp chưa cài</w:t>
       </w:r>
     </w:p>
     <w:p>
@@ -4471,16 +5695,14 @@
           <w:ilvl w:val="0"/>
           <w:numId w:val="2"/>
         </w:numPr>
+        <w:spacing w:after="240" w:before="0" w:beforeAutospacing="0" w:lineRule="auto"/>
         <w:ind w:left="720" w:hanging="360"/>
-        <w:rPr>
-          <w:u w:val="none"/>
-        </w:rPr>
-      </w:pPr>
-      <w:r>
-        <w:rPr>
-          <w:rtl w:val="0"/>
-        </w:rPr>
-        <w:t xml:space="preserve">Nếu AI báo lỗi không thể sử dụng được FIGMA thì thư các bước sau</w:t>
+      </w:pPr>
+      <w:r>
+        <w:rPr>
+          <w:rtl w:val="0"/>
+        </w:rPr>
+        <w:t xml:space="preserve">Tài khoản Anthropic: gói Claude trả phí (Pro, Max, Team, Enterprise)</w:t>
       </w:r>
     </w:p>
     <w:p>
@@ -4496,25 +5718,765 @@
           <w:bCs w:val="1"/>
           <w:rtl w:val="0"/>
         </w:rPr>
-        <w:t xml:space="preserve">Bước 1 : Copy và dán nội dung dưới đây vào AI </w:t>
-      </w:r>
-    </w:p>
-    <w:p>
-      <w:pPr>
+        <w:t xml:space="preserve">※ Cài đặt:</w:t>
+      </w:r>
+    </w:p>
+    <w:p>
+      <w:pPr>
+        <w:numPr>
+          <w:ilvl w:val="0"/>
+          <w:numId w:val="6"/>
+        </w:numPr>
+        <w:spacing w:after="240" w:before="240" w:lineRule="auto"/>
+        <w:ind w:left="720" w:hanging="360"/>
+        <w:rPr>
+          <w:b w:val="1"/>
+          <w:bCs w:val="1"/>
+        </w:rPr>
+      </w:pPr>
+      <w:r>
+        <w:rPr>
+          <w:rtl w:val="0"/>
+        </w:rPr>
+        <w:t xml:space="preserve">Mở Extensions (</w:t>
+      </w:r>
+      <w:r>
         <w:rPr>
           <w:rFonts w:ascii="Roboto Mono" w:cs="Roboto Mono" w:eastAsia="Roboto Mono" w:hAnsi="Roboto Mono"/>
           <w:color w:val="188038"/>
-        </w:rPr>
-      </w:pPr>
+          <w:rtl w:val="0"/>
+        </w:rPr>
+        <w:t xml:space="preserve">Ctrl+Shift+X</w:t>
+      </w:r>
+      <w:r>
+        <w:rPr>
+          <w:rtl w:val="0"/>
+        </w:rPr>
+        <w:t xml:space="preserve"> / </w:t>
+      </w:r>
       <w:r>
         <w:rPr>
           <w:rFonts w:ascii="Roboto Mono" w:cs="Roboto Mono" w:eastAsia="Roboto Mono" w:hAnsi="Roboto Mono"/>
           <w:color w:val="188038"/>
           <w:rtl w:val="0"/>
         </w:rPr>
+        <w:t xml:space="preserve">Cmd+Shift+X</w:t>
+      </w:r>
+      <w:r>
+        <w:rPr>
+          <w:rtl w:val="0"/>
+        </w:rPr>
+        <w:t xml:space="preserve">), tìm </w:t>
+      </w:r>
+      <w:r>
+        <w:rPr>
+          <w:rFonts w:ascii="Roboto Mono" w:cs="Roboto Mono" w:eastAsia="Roboto Mono" w:hAnsi="Roboto Mono"/>
+          <w:color w:val="188038"/>
+          <w:rtl w:val="0"/>
+        </w:rPr>
+        <w:t xml:space="preserve">Claude Code for VS Code</w:t>
+      </w:r>
+      <w:sdt>
+        <w:sdtPr>
+          <w:id w:val="676479095"/>
+          <w:tag w:val="goog_rdk_7"/>
+        </w:sdtPr>
+        <w:sdtContent>
+          <w:r>
+            <w:rPr>
+              <w:rFonts w:ascii="Arial Unicode MS" w:cs="Arial Unicode MS" w:eastAsia="Arial Unicode MS" w:hAnsi="Arial Unicode MS"/>
+              <w:rtl w:val="0"/>
+            </w:rPr>
+            <w:t xml:space="preserve"> (publisher Anthropic) → Install. </w:t>
+          </w:r>
+        </w:sdtContent>
+      </w:sdt>
+    </w:p>
+    <w:p>
+      <w:pPr>
+        <w:spacing w:after="240" w:before="240" w:lineRule="auto"/>
+        <w:ind w:left="720" w:firstLine="0"/>
+        <w:rPr/>
+      </w:pPr>
+      <w:r>
+        <w:rPr>
+          <w:rtl w:val="0"/>
+        </w:rPr>
+      </w:r>
+      <w:r>
+        <w:drawing>
+          <wp:anchor allowOverlap="1" behindDoc="0" distB="114300" distT="114300" distL="114300" distR="114300" hidden="0" layoutInCell="1" locked="0" relativeHeight="0" simplePos="0">
+            <wp:simplePos x="0" y="0"/>
+            <wp:positionH relativeFrom="column">
+              <wp:posOffset>476250</wp:posOffset>
+            </wp:positionH>
+            <wp:positionV relativeFrom="paragraph">
+              <wp:posOffset>114300</wp:posOffset>
+            </wp:positionV>
+            <wp:extent cx="6583680" cy="4851400"/>
+            <wp:effectExtent b="0" l="0" r="0" t="0"/>
+            <wp:wrapSquare wrapText="bothSides" distB="114300" distT="114300" distL="114300" distR="114300"/>
+            <wp:docPr id="1997424760" name="image15.png"/>
+            <a:graphic>
+              <a:graphicData uri="http://schemas.openxmlformats.org/drawingml/2006/picture">
+                <pic:pic>
+                  <pic:nvPicPr>
+                    <pic:cNvPr id="0" name="image15.png"/>
+                    <pic:cNvPicPr preferRelativeResize="0"/>
+                  </pic:nvPicPr>
+                  <pic:blipFill>
+                    <a:blip r:embed="rId25"/>
+                    <a:srcRect b="0" l="0" r="0" t="0"/>
+                    <a:stretch>
+                      <a:fillRect/>
+                    </a:stretch>
+                  </pic:blipFill>
+                  <pic:spPr>
+                    <a:xfrm>
+                      <a:off x="0" y="0"/>
+                      <a:ext cx="6583680" cy="4851400"/>
+                    </a:xfrm>
+                    <a:prstGeom prst="rect"/>
+                    <a:ln/>
+                  </pic:spPr>
+                </pic:pic>
+              </a:graphicData>
+            </a:graphic>
+          </wp:anchor>
+        </w:drawing>
+      </w:r>
+    </w:p>
+    <w:p>
+      <w:pPr>
+        <w:spacing w:after="240" w:before="240" w:lineRule="auto"/>
+        <w:ind w:left="720" w:firstLine="0"/>
+        <w:rPr/>
+      </w:pPr>
+      <w:r>
+        <w:rPr>
+          <w:rtl w:val="0"/>
+        </w:rPr>
+        <w:t xml:space="preserve">Hoặc mở Terminal chạy: </w:t>
+      </w:r>
+      <w:r>
+        <w:rPr>
+          <w:rFonts w:ascii="Roboto Mono" w:cs="Roboto Mono" w:eastAsia="Roboto Mono" w:hAnsi="Roboto Mono"/>
+          <w:color w:val="188038"/>
+          <w:rtl w:val="0"/>
+        </w:rPr>
+        <w:t xml:space="preserve">code --install-extension anthropic.claude-code</w:t>
+      </w:r>
+      <w:r>
+        <w:rPr>
+          <w:rtl w:val="0"/>
+        </w:rPr>
+        <w:t xml:space="preserve">.</w:t>
+      </w:r>
+    </w:p>
+    <w:p>
+      <w:pPr>
+        <w:numPr>
+          <w:ilvl w:val="0"/>
+          <w:numId w:val="6"/>
+        </w:numPr>
+        <w:spacing w:after="240" w:before="240" w:lineRule="auto"/>
+        <w:ind w:left="720" w:hanging="360"/>
+        <w:rPr/>
+      </w:pPr>
+      <w:r>
+        <w:rPr>
+          <w:rtl w:val="0"/>
+        </w:rPr>
+        <w:t xml:space="preserve">Sau khi hoàn tất install, thanh sidebar VS Code hiển thị icon </w:t>
+      </w:r>
+      <w:r>
+        <w:rPr>
+          <w:rFonts w:ascii="Roboto Mono" w:cs="Roboto Mono" w:eastAsia="Roboto Mono" w:hAnsi="Roboto Mono"/>
+          <w:color w:val="188038"/>
+          <w:rtl w:val="0"/>
+        </w:rPr>
+        <w:t xml:space="preserve">Claude Code</w:t>
+      </w:r>
+      <w:r>
+        <w:rPr>
+          <w:rtl w:val="0"/>
+        </w:rPr>
+        <w:t xml:space="preserve"> như ảnh</w:t>
+      </w:r>
+    </w:p>
+    <w:p>
+      <w:pPr>
+        <w:spacing w:after="240" w:before="240" w:lineRule="auto"/>
+        <w:ind w:left="720" w:firstLine="0"/>
+        <w:rPr/>
+      </w:pPr>
+      <w:r>
+        <w:rPr>
+          <w:rtl w:val="0"/>
+        </w:rPr>
+        <w:t xml:space="preserve">Nếu không thấy extension sau khi cài: bấm </w:t>
+      </w:r>
+      <w:r>
+        <w:rPr>
+          <w:rFonts w:ascii="Roboto Mono" w:cs="Roboto Mono" w:eastAsia="Roboto Mono" w:hAnsi="Roboto Mono"/>
+          <w:color w:val="188038"/>
+          <w:rtl w:val="0"/>
+        </w:rPr>
+        <w:t xml:space="preserve">Ctrl+Shift+P</w:t>
+      </w:r>
+      <w:r>
+        <w:rPr>
+          <w:rtl w:val="0"/>
+        </w:rPr>
+        <w:t xml:space="preserve"> / </w:t>
+      </w:r>
+      <w:r>
+        <w:rPr>
+          <w:rFonts w:ascii="Roboto Mono" w:cs="Roboto Mono" w:eastAsia="Roboto Mono" w:hAnsi="Roboto Mono"/>
+          <w:color w:val="188038"/>
+          <w:rtl w:val="0"/>
+        </w:rPr>
+        <w:t xml:space="preserve">Cmd+Shift+P</w:t>
+      </w:r>
+      <w:sdt>
+        <w:sdtPr>
+          <w:id w:val="-1068367048"/>
+          <w:tag w:val="goog_rdk_8"/>
+        </w:sdtPr>
+        <w:sdtContent>
+          <w:r>
+            <w:rPr>
+              <w:rFonts w:ascii="Arial Unicode MS" w:cs="Arial Unicode MS" w:eastAsia="Arial Unicode MS" w:hAnsi="Arial Unicode MS"/>
+              <w:rtl w:val="0"/>
+            </w:rPr>
+            <w:t xml:space="preserve"> → gõ  </w:t>
+          </w:r>
+        </w:sdtContent>
+      </w:sdt>
+      <w:r>
+        <w:rPr>
+          <w:rFonts w:ascii="Roboto Mono" w:cs="Roboto Mono" w:eastAsia="Roboto Mono" w:hAnsi="Roboto Mono"/>
+          <w:color w:val="188038"/>
+          <w:rtl w:val="0"/>
+        </w:rPr>
+        <w:t xml:space="preserve">Developer: Reload Window </w:t>
+      </w:r>
+      <w:r>
+        <w:rPr>
+          <w:rtl w:val="0"/>
+        </w:rPr>
+        <w:t xml:space="preserve">→  Enter để reload → Kiểm tra hiển thị Extension</w:t>
+      </w:r>
+    </w:p>
+    <w:p>
+      <w:pPr>
+        <w:spacing w:after="240" w:before="240" w:lineRule="auto"/>
+        <w:ind w:left="720" w:firstLine="0"/>
+        <w:rPr/>
+      </w:pPr>
+      <w:r>
+        <w:rPr/>
+        <w:drawing>
+          <wp:inline distB="114300" distT="114300" distL="114300" distR="114300">
+            <wp:extent cx="3638550" cy="6096000"/>
+            <wp:effectExtent b="0" l="0" r="0" t="0"/>
+            <wp:docPr id="1997424746" name="image1.png"/>
+            <a:graphic>
+              <a:graphicData uri="http://schemas.openxmlformats.org/drawingml/2006/picture">
+                <pic:pic>
+                  <pic:nvPicPr>
+                    <pic:cNvPr id="0" name="image1.png"/>
+                    <pic:cNvPicPr preferRelativeResize="0"/>
+                  </pic:nvPicPr>
+                  <pic:blipFill>
+                    <a:blip r:embed="rId26"/>
+                    <a:srcRect b="0" l="0" r="0" t="0"/>
+                    <a:stretch>
+                      <a:fillRect/>
+                    </a:stretch>
+                  </pic:blipFill>
+                  <pic:spPr>
+                    <a:xfrm>
+                      <a:off x="0" y="0"/>
+                      <a:ext cx="3638550" cy="6096000"/>
+                    </a:xfrm>
+                    <a:prstGeom prst="rect"/>
+                    <a:ln/>
+                  </pic:spPr>
+                </pic:pic>
+              </a:graphicData>
+            </a:graphic>
+          </wp:inline>
+        </w:drawing>
+      </w:r>
+      <w:r>
+        <w:rPr>
+          <w:rtl w:val="0"/>
+        </w:rPr>
+      </w:r>
+    </w:p>
+    <w:p>
+      <w:pPr>
+        <w:rPr>
+          <w:b w:val="1"/>
+          <w:bCs w:val="1"/>
+        </w:rPr>
+      </w:pPr>
+      <w:r>
+        <w:rPr>
+          <w:b w:val="1"/>
+          <w:bCs w:val="1"/>
+          <w:rtl w:val="0"/>
+        </w:rPr>
+        <w:t xml:space="preserve">※ </w:t>
+      </w:r>
+      <w:r>
+        <w:rPr>
+          <w:b w:val="1"/>
+          <w:bCs w:val="1"/>
+          <w:rtl w:val="0"/>
+        </w:rPr>
+        <w:t xml:space="preserve">Đăng nhập và bắt đầu</w:t>
+      </w:r>
+    </w:p>
+    <w:p>
+      <w:pPr>
+        <w:numPr>
+          <w:ilvl w:val="0"/>
+          <w:numId w:val="3"/>
+        </w:numPr>
+        <w:spacing w:after="240" w:before="240" w:lineRule="auto"/>
+        <w:ind w:left="720" w:hanging="360"/>
+        <w:rPr/>
+      </w:pPr>
+      <w:r>
+        <w:rPr>
+          <w:rtl w:val="0"/>
+        </w:rPr>
+        <w:t xml:space="preserve">Mở panel: </w:t>
+      </w:r>
+    </w:p>
+    <w:p>
+      <w:pPr>
+        <w:spacing w:after="240" w:before="240" w:lineRule="auto"/>
+        <w:ind w:left="720" w:firstLine="0"/>
+        <w:rPr/>
+      </w:pPr>
+      <w:sdt>
+        <w:sdtPr>
+          <w:id w:val="1924293806"/>
+          <w:tag w:val="goog_rdk_9"/>
+        </w:sdtPr>
+        <w:sdtContent>
+          <w:r>
+            <w:rPr>
+              <w:rFonts w:ascii="Arial Unicode MS" w:cs="Arial Unicode MS" w:eastAsia="Arial Unicode MS" w:hAnsi="Arial Unicode MS"/>
+              <w:rtl w:val="0"/>
+            </w:rPr>
+            <w:t xml:space="preserve">Cách 1: Click trực tiếp vào extension ở sidebar → panel </w:t>
+          </w:r>
+        </w:sdtContent>
+      </w:sdt>
+      <w:r>
+        <w:rPr>
+          <w:rFonts w:ascii="Roboto Mono" w:cs="Roboto Mono" w:eastAsia="Roboto Mono" w:hAnsi="Roboto Mono"/>
+          <w:color w:val="188038"/>
+          <w:rtl w:val="0"/>
+        </w:rPr>
+        <w:t xml:space="preserve">Claude Code</w:t>
+      </w:r>
+      <w:r>
+        <w:rPr>
+          <w:rtl w:val="0"/>
+        </w:rPr>
+        <w:t xml:space="preserve"> hiển thị</w:t>
+      </w:r>
+    </w:p>
+    <w:p>
+      <w:pPr>
+        <w:spacing w:after="240" w:before="240" w:lineRule="auto"/>
+        <w:ind w:left="720" w:firstLine="0"/>
+        <w:rPr/>
+      </w:pPr>
+      <w:r>
+        <w:rPr>
+          <w:rtl w:val="0"/>
+        </w:rPr>
+        <w:t xml:space="preserve">Cách 2: Bấm </w:t>
+      </w:r>
+      <w:r>
+        <w:rPr>
+          <w:rFonts w:ascii="Roboto Mono" w:cs="Roboto Mono" w:eastAsia="Roboto Mono" w:hAnsi="Roboto Mono"/>
+          <w:color w:val="188038"/>
+          <w:rtl w:val="0"/>
+        </w:rPr>
+        <w:t xml:space="preserve">Ctrl+Shift+P</w:t>
+      </w:r>
+      <w:r>
+        <w:rPr>
+          <w:rtl w:val="0"/>
+        </w:rPr>
+        <w:t xml:space="preserve"> / </w:t>
+      </w:r>
+      <w:r>
+        <w:rPr>
+          <w:rFonts w:ascii="Roboto Mono" w:cs="Roboto Mono" w:eastAsia="Roboto Mono" w:hAnsi="Roboto Mono"/>
+          <w:color w:val="188038"/>
+          <w:rtl w:val="0"/>
+        </w:rPr>
+        <w:t xml:space="preserve">Cmd+Shift+P</w:t>
+      </w:r>
+      <w:sdt>
+        <w:sdtPr>
+          <w:id w:val="273321772"/>
+          <w:tag w:val="goog_rdk_10"/>
+        </w:sdtPr>
+        <w:sdtContent>
+          <w:r>
+            <w:rPr>
+              <w:rFonts w:ascii="Arial Unicode MS" w:cs="Arial Unicode MS" w:eastAsia="Arial Unicode MS" w:hAnsi="Arial Unicode MS"/>
+              <w:rtl w:val="0"/>
+            </w:rPr>
+            <w:t xml:space="preserve"> →  gõ  </w:t>
+          </w:r>
+        </w:sdtContent>
+      </w:sdt>
+      <w:r>
+        <w:rPr>
+          <w:rFonts w:ascii="Roboto Mono" w:cs="Roboto Mono" w:eastAsia="Roboto Mono" w:hAnsi="Roboto Mono"/>
+          <w:color w:val="188038"/>
+          <w:rtl w:val="0"/>
+        </w:rPr>
+        <w:t xml:space="preserve">Claude Code Input </w:t>
+      </w:r>
+      <w:sdt>
+        <w:sdtPr>
+          <w:id w:val="-1769354124"/>
+          <w:tag w:val="goog_rdk_11"/>
+        </w:sdtPr>
+        <w:sdtContent>
+          <w:r>
+            <w:rPr>
+              <w:rFonts w:ascii="Arial Unicode MS" w:cs="Arial Unicode MS" w:eastAsia="Arial Unicode MS" w:hAnsi="Arial Unicode MS"/>
+              <w:rtl w:val="0"/>
+            </w:rPr>
+            <w:t xml:space="preserve">→ panel  </w:t>
+          </w:r>
+        </w:sdtContent>
+      </w:sdt>
+      <w:r>
+        <w:rPr>
+          <w:rFonts w:ascii="Roboto Mono" w:cs="Roboto Mono" w:eastAsia="Roboto Mono" w:hAnsi="Roboto Mono"/>
+          <w:color w:val="188038"/>
+          <w:rtl w:val="0"/>
+        </w:rPr>
+        <w:t xml:space="preserve">Claude Code </w:t>
+      </w:r>
+      <w:r>
+        <w:rPr>
+          <w:rtl w:val="0"/>
+        </w:rPr>
+        <w:t xml:space="preserve">hiển thị</w:t>
+      </w:r>
+    </w:p>
+    <w:p>
+      <w:pPr>
+        <w:spacing w:after="240" w:before="240" w:lineRule="auto"/>
+        <w:ind w:left="720" w:firstLine="0"/>
+        <w:rPr/>
+      </w:pPr>
+      <w:sdt>
+        <w:sdtPr>
+          <w:id w:val="1180628563"/>
+          <w:tag w:val="goog_rdk_12"/>
+        </w:sdtPr>
+        <w:sdtContent>
+          <w:r>
+            <w:rPr>
+              <w:rFonts w:ascii="Arial Unicode MS" w:cs="Arial Unicode MS" w:eastAsia="Arial Unicode MS" w:hAnsi="Arial Unicode MS"/>
+              <w:rtl w:val="0"/>
+            </w:rPr>
+            <w:t xml:space="preserve">Cách 3: Mở 1 file ở VS Code → click extension  </w:t>
+          </w:r>
+        </w:sdtContent>
+      </w:sdt>
+      <w:r>
+        <w:rPr>
+          <w:rFonts w:ascii="Roboto Mono" w:cs="Roboto Mono" w:eastAsia="Roboto Mono" w:hAnsi="Roboto Mono"/>
+          <w:color w:val="188038"/>
+          <w:rtl w:val="0"/>
+        </w:rPr>
+        <w:t xml:space="preserve">Claude Code </w:t>
+      </w:r>
+      <w:r>
+        <w:rPr>
+          <w:rtl w:val="0"/>
+        </w:rPr>
+        <w:t xml:space="preserve">trên góc phải</w:t>
+      </w:r>
+    </w:p>
+    <w:p>
+      <w:pPr>
+        <w:spacing w:after="240" w:before="240" w:lineRule="auto"/>
+        <w:ind w:left="720" w:firstLine="0"/>
+        <w:rPr/>
+      </w:pPr>
+      <w:r>
+        <w:rPr/>
+        <w:drawing>
+          <wp:inline distB="114300" distT="114300" distL="114300" distR="114300">
+            <wp:extent cx="6143935" cy="3435222"/>
+            <wp:effectExtent b="0" l="0" r="0" t="0"/>
+            <wp:docPr id="1997424762" name="image20.png"/>
+            <a:graphic>
+              <a:graphicData uri="http://schemas.openxmlformats.org/drawingml/2006/picture">
+                <pic:pic>
+                  <pic:nvPicPr>
+                    <pic:cNvPr id="0" name="image20.png"/>
+                    <pic:cNvPicPr preferRelativeResize="0"/>
+                  </pic:nvPicPr>
+                  <pic:blipFill>
+                    <a:blip r:embed="rId27"/>
+                    <a:srcRect b="0" l="0" r="0" t="0"/>
+                    <a:stretch>
+                      <a:fillRect/>
+                    </a:stretch>
+                  </pic:blipFill>
+                  <pic:spPr>
+                    <a:xfrm>
+                      <a:off x="0" y="0"/>
+                      <a:ext cx="6143935" cy="3435222"/>
+                    </a:xfrm>
+                    <a:prstGeom prst="rect"/>
+                    <a:ln/>
+                  </pic:spPr>
+                </pic:pic>
+              </a:graphicData>
+            </a:graphic>
+          </wp:inline>
+        </w:drawing>
+      </w:r>
+      <w:r>
+        <w:rPr>
+          <w:rtl w:val="0"/>
+        </w:rPr>
+      </w:r>
+    </w:p>
+    <w:p>
+      <w:pPr>
+        <w:numPr>
+          <w:ilvl w:val="0"/>
+          <w:numId w:val="3"/>
+        </w:numPr>
+        <w:spacing w:after="240" w:before="240" w:lineRule="auto"/>
+        <w:ind w:left="720" w:hanging="360"/>
+        <w:rPr/>
+      </w:pPr>
+      <w:sdt>
+        <w:sdtPr>
+          <w:id w:val="-1724298346"/>
+          <w:tag w:val="goog_rdk_13"/>
+        </w:sdtPr>
+        <w:sdtContent>
+          <w:r>
+            <w:rPr>
+              <w:rFonts w:ascii="Arial Unicode MS" w:cs="Arial Unicode MS" w:eastAsia="Arial Unicode MS" w:hAnsi="Arial Unicode MS"/>
+              <w:rtl w:val="0"/>
+            </w:rPr>
+            <w:t xml:space="preserve">Bấm Sign in → xác thực trên trình duyệt.</w:t>
+          </w:r>
+        </w:sdtContent>
+      </w:sdt>
+      <w:r>
+        <w:drawing>
+          <wp:anchor allowOverlap="1" behindDoc="0" distB="114300" distT="114300" distL="114300" distR="114300" hidden="0" layoutInCell="1" locked="0" relativeHeight="0" simplePos="0">
+            <wp:simplePos x="0" y="0"/>
+            <wp:positionH relativeFrom="column">
+              <wp:posOffset>495300</wp:posOffset>
+            </wp:positionH>
+            <wp:positionV relativeFrom="paragraph">
+              <wp:posOffset>352425</wp:posOffset>
+            </wp:positionV>
+            <wp:extent cx="2990489" cy="4578222"/>
+            <wp:effectExtent b="0" l="0" r="0" t="0"/>
+            <wp:wrapTopAndBottom distB="114300" distT="114300"/>
+            <wp:docPr id="1997424747" name="image19.png"/>
+            <a:graphic>
+              <a:graphicData uri="http://schemas.openxmlformats.org/drawingml/2006/picture">
+                <pic:pic>
+                  <pic:nvPicPr>
+                    <pic:cNvPr id="0" name="image19.png"/>
+                    <pic:cNvPicPr preferRelativeResize="0"/>
+                  </pic:nvPicPr>
+                  <pic:blipFill>
+                    <a:blip r:embed="rId28"/>
+                    <a:srcRect b="0" l="0" r="0" t="0"/>
+                    <a:stretch>
+                      <a:fillRect/>
+                    </a:stretch>
+                  </pic:blipFill>
+                  <pic:spPr>
+                    <a:xfrm>
+                      <a:off x="0" y="0"/>
+                      <a:ext cx="2990489" cy="4578222"/>
+                    </a:xfrm>
+                    <a:prstGeom prst="rect"/>
+                    <a:ln/>
+                  </pic:spPr>
+                </pic:pic>
+              </a:graphicData>
+            </a:graphic>
+          </wp:anchor>
+        </w:drawing>
+      </w:r>
+    </w:p>
+    <w:p>
+      <w:pPr>
+        <w:spacing w:after="240" w:before="240" w:lineRule="auto"/>
+        <w:rPr/>
+      </w:pPr>
+      <w:r>
+        <w:rPr>
+          <w:rtl w:val="0"/>
+        </w:rPr>
+        <w:tab/>
+        <w:t xml:space="preserve">TH không hiển thị giao diện sign-in như trên, ở panel chat Claude Code gõ </w:t>
+      </w:r>
+      <w:r>
+        <w:rPr>
+          <w:rFonts w:ascii="Roboto Mono" w:cs="Roboto Mono" w:eastAsia="Roboto Mono" w:hAnsi="Roboto Mono"/>
+          <w:color w:val="188038"/>
+          <w:rtl w:val="0"/>
+        </w:rPr>
+        <w:t xml:space="preserve">/login</w:t>
+      </w:r>
+      <w:sdt>
+        <w:sdtPr>
+          <w:id w:val="-121088976"/>
+          <w:tag w:val="goog_rdk_14"/>
+        </w:sdtPr>
+        <w:sdtContent>
+          <w:r>
+            <w:rPr>
+              <w:rFonts w:ascii="Arial Unicode MS" w:cs="Arial Unicode MS" w:eastAsia="Arial Unicode MS" w:hAnsi="Arial Unicode MS"/>
+              <w:rtl w:val="0"/>
+            </w:rPr>
+            <w:t xml:space="preserve">  → Enter → tiếp tục hoàn tất Sign-in</w:t>
+          </w:r>
+        </w:sdtContent>
+      </w:sdt>
+    </w:p>
+    <w:p>
+      <w:pPr>
+        <w:numPr>
+          <w:ilvl w:val="0"/>
+          <w:numId w:val="3"/>
+        </w:numPr>
+        <w:spacing w:after="240" w:before="240" w:lineRule="auto"/>
+        <w:ind w:left="720" w:hanging="360"/>
+        <w:rPr/>
+      </w:pPr>
+      <w:r>
+        <w:rPr>
+          <w:rtl w:val="0"/>
+        </w:rPr>
+        <w:t xml:space="preserve">Gửi prompt đầu tiên, ví dụ: "Hello" → hệ thống phản hồi: setup thành công 🙌</w:t>
+      </w:r>
+    </w:p>
+    <w:p>
+      <w:pPr>
+        <w:rPr>
+          <w:b w:val="1"/>
+          <w:bCs w:val="1"/>
+        </w:rPr>
+      </w:pPr>
+      <w:r>
+        <w:rPr>
+          <w:rtl w:val="0"/>
+        </w:rPr>
+      </w:r>
+    </w:p>
+    <w:p>
+      <w:pPr>
+        <w:pStyle w:val="Heading3"/>
+        <w:rPr>
+          <w:sz w:val="29"/>
+          <w:szCs w:val="29"/>
+        </w:rPr>
+      </w:pPr>
+      <w:bookmarkStart w:colFirst="0" w:colLast="0" w:name="_heading=h.lfp8lzoyj59c" w:id="10"/>
+      <w:bookmarkEnd w:id="10"/>
+      <w:r>
+        <w:rPr>
+          <w:sz w:val="29"/>
+          <w:szCs w:val="29"/>
+          <w:rtl w:val="0"/>
+        </w:rPr>
+        <w:t xml:space="preserve">2 - Kết nối với FIGMA </w:t>
+      </w:r>
+    </w:p>
+    <w:p>
+      <w:pPr>
+        <w:numPr>
+          <w:ilvl w:val="0"/>
+          <w:numId w:val="4"/>
+        </w:numPr>
+        <w:ind w:left="720" w:hanging="360"/>
+      </w:pPr>
+      <w:r>
+        <w:rPr>
+          <w:rtl w:val="0"/>
+        </w:rPr>
+        <w:t xml:space="preserve">Yêu cầu phải dùng FIGMA của công ty cấp - liên hệ bộ phận QA để lấy thông tin tài khoản </w:t>
+      </w:r>
+    </w:p>
+    <w:p>
+      <w:pPr>
+        <w:numPr>
+          <w:ilvl w:val="0"/>
+          <w:numId w:val="4"/>
+        </w:numPr>
+        <w:ind w:left="720" w:hanging="360"/>
+      </w:pPr>
+      <w:r>
+        <w:rPr>
+          <w:rtl w:val="0"/>
+        </w:rPr>
+        <w:t xml:space="preserve">Nếu AI báo lỗi không thể sử dụng được FIGMA thì thư các bước sau</w:t>
+      </w:r>
+    </w:p>
+    <w:p>
+      <w:pPr>
+        <w:rPr>
+          <w:b w:val="1"/>
+          <w:bCs w:val="1"/>
+        </w:rPr>
+      </w:pPr>
+      <w:r>
+        <w:rPr>
+          <w:b w:val="1"/>
+          <w:bCs w:val="1"/>
+          <w:rtl w:val="0"/>
+        </w:rPr>
+        <w:t xml:space="preserve">Bước 1 : Copy và dán nội dung dưới đây vào AI </w:t>
+      </w:r>
+    </w:p>
+    <w:p>
+      <w:pPr>
+        <w:rPr>
+          <w:rFonts w:ascii="Roboto Mono" w:cs="Roboto Mono" w:eastAsia="Roboto Mono" w:hAnsi="Roboto Mono"/>
+          <w:color w:val="188038"/>
+        </w:rPr>
+      </w:pPr>
+      <w:r>
+        <w:rPr>
+          <w:rFonts w:ascii="Roboto Mono" w:cs="Roboto Mono" w:eastAsia="Roboto Mono" w:hAnsi="Roboto Mono"/>
+          <w:color w:val="188038"/>
+          <w:rtl w:val="0"/>
+        </w:rPr>
         <w:t xml:space="preserve">claude mcp add --transport http figma </w:t>
       </w:r>
-      <w:hyperlink r:id="rId22">
+      <w:hyperlink r:id="rId29">
         <w:r>
           <w:rPr>
             <w:rFonts w:ascii="Roboto Mono" w:cs="Roboto Mono" w:eastAsia="Roboto Mono" w:hAnsi="Roboto Mono"/>
@@ -4540,8 +6502,8 @@
       </w:pPr>
       <w:sdt>
         <w:sdtPr>
-          <w:id w:val="222175510"/>
-          <w:tag w:val="goog_rdk_5"/>
+          <w:id w:val="1093312800"/>
+          <w:tag w:val="goog_rdk_15"/>
         </w:sdtPr>
         <w:sdtContent>
           <w:r>
@@ -4577,7 +6539,7 @@
           <w:ilvl w:val="0"/>
           <w:numId w:val="1"/>
         </w:numPr>
-        <w:spacing w:after="0" w:afterAutospacing="0" w:before="240" w:lineRule="auto"/>
+        <w:spacing w:after="240" w:before="240" w:lineRule="auto"/>
         <w:ind w:left="720" w:hanging="360"/>
         <w:rPr>
           <w:rFonts w:ascii="Roboto Mono" w:cs="Roboto Mono" w:eastAsia="Roboto Mono" w:hAnsi="Roboto Mono"/>
@@ -4599,7 +6561,7 @@
           <w:ilvl w:val="0"/>
           <w:numId w:val="1"/>
         </w:numPr>
-        <w:spacing w:after="240" w:before="0" w:beforeAutospacing="0" w:lineRule="auto"/>
+        <w:spacing w:after="240" w:before="240" w:lineRule="auto"/>
         <w:ind w:left="720" w:hanging="360"/>
         <w:rPr>
           <w:rFonts w:ascii="Roboto Mono" w:cs="Roboto Mono" w:eastAsia="Roboto Mono" w:hAnsi="Roboto Mono"/>
@@ -4636,16 +6598,16 @@
           <wp:inline distB="114300" distT="114300" distL="114300" distR="114300">
             <wp:extent cx="3963353" cy="3756868"/>
             <wp:effectExtent b="0" l="0" r="0" t="0"/>
-            <wp:docPr id="1997424746" name="image11.png"/>
+            <wp:docPr id="1997424752" name="image14.png"/>
             <a:graphic>
               <a:graphicData uri="http://schemas.openxmlformats.org/drawingml/2006/picture">
                 <pic:pic>
                   <pic:nvPicPr>
-                    <pic:cNvPr id="0" name="image11.png"/>
+                    <pic:cNvPr id="0" name="image14.png"/>
                     <pic:cNvPicPr preferRelativeResize="0"/>
                   </pic:nvPicPr>
                   <pic:blipFill>
-                    <a:blip r:embed="rId23"/>
+                    <a:blip r:embed="rId30"/>
                     <a:srcRect b="0" l="0" r="0" t="0"/>
                     <a:stretch>
                       <a:fillRect/>
@@ -4757,16 +6719,16 @@
           <wp:inline distB="114300" distT="114300" distL="114300" distR="114300">
             <wp:extent cx="4781550" cy="3933825"/>
             <wp:effectExtent b="0" l="0" r="0" t="0"/>
-            <wp:docPr id="1997424748" name="image1.jpg"/>
+            <wp:docPr id="1997424763" name="image18.jpg"/>
             <a:graphic>
               <a:graphicData uri="http://schemas.openxmlformats.org/drawingml/2006/picture">
                 <pic:pic>
                   <pic:nvPicPr>
-                    <pic:cNvPr id="0" name="image1.jpg"/>
+                    <pic:cNvPr id="0" name="image18.jpg"/>
                     <pic:cNvPicPr preferRelativeResize="0"/>
                   </pic:nvPicPr>
                   <pic:blipFill>
-                    <a:blip r:embed="rId24"/>
+                    <a:blip r:embed="rId31"/>
                     <a:srcRect b="0" l="0" r="0" t="0"/>
                     <a:stretch>
                       <a:fillRect/>
@@ -4792,23 +6754,9 @@
         </w:rPr>
       </w:r>
     </w:p>
-    <w:p>
-      <w:pPr>
-        <w:ind w:left="0" w:firstLine="0"/>
-        <w:rPr>
-          <w:rFonts w:ascii="Roboto Mono" w:cs="Roboto Mono" w:eastAsia="Roboto Mono" w:hAnsi="Roboto Mono"/>
-          <w:color w:val="188038"/>
-        </w:rPr>
-      </w:pPr>
-      <w:r>
-        <w:rPr>
-          <w:rtl w:val="0"/>
-        </w:rPr>
-      </w:r>
-    </w:p>
     <w:sectPr>
-      <w:headerReference r:id="rId25" w:type="default"/>
-      <w:footerReference r:id="rId26" w:type="default"/>
+      <w:headerReference r:id="rId32" w:type="default"/>
+      <w:footerReference r:id="rId33" w:type="default"/>
       <w:pgSz w:h="15840" w:w="12240" w:orient="portrait"/>
       <w:pgMar w:bottom="792" w:top="792" w:left="936" w:right="936" w:header="720" w:footer="720"/>
       <w:pgNumType w:start="1"/>
@@ -4914,6 +6862,16 @@
       </w:rPr>
     </w:r>
   </w:p>
+  <w:p>
+    <w:pPr>
+      <w:rPr/>
+    </w:pPr>
+    <w:r>
+      <w:rPr>
+        <w:rtl w:val="0"/>
+      </w:rPr>
+    </w:r>
+  </w:p>
 </w:hdr>
 </file>
 
@@ -5033,6 +6991,226 @@
     <w:lvl w:ilvl="0">
       <w:start w:val="1"/>
       <w:numFmt w:val="bullet"/>
+      <w:lvlText w:val="●"/>
+      <w:lvlJc w:val="left"/>
+      <w:pPr>
+        <w:ind w:left="720" w:hanging="360"/>
+      </w:pPr>
+      <w:rPr>
+        <w:u w:val="none"/>
+      </w:rPr>
+    </w:lvl>
+    <w:lvl w:ilvl="1">
+      <w:start w:val="1"/>
+      <w:numFmt w:val="bullet"/>
+      <w:lvlText w:val="○"/>
+      <w:lvlJc w:val="left"/>
+      <w:pPr>
+        <w:ind w:left="1440" w:hanging="360"/>
+      </w:pPr>
+      <w:rPr>
+        <w:u w:val="none"/>
+      </w:rPr>
+    </w:lvl>
+    <w:lvl w:ilvl="2">
+      <w:start w:val="1"/>
+      <w:numFmt w:val="bullet"/>
+      <w:lvlText w:val="■"/>
+      <w:lvlJc w:val="left"/>
+      <w:pPr>
+        <w:ind w:left="2160" w:hanging="360"/>
+      </w:pPr>
+      <w:rPr>
+        <w:u w:val="none"/>
+      </w:rPr>
+    </w:lvl>
+    <w:lvl w:ilvl="3">
+      <w:start w:val="1"/>
+      <w:numFmt w:val="bullet"/>
+      <w:lvlText w:val="●"/>
+      <w:lvlJc w:val="left"/>
+      <w:pPr>
+        <w:ind w:left="2880" w:hanging="360"/>
+      </w:pPr>
+      <w:rPr>
+        <w:u w:val="none"/>
+      </w:rPr>
+    </w:lvl>
+    <w:lvl w:ilvl="4">
+      <w:start w:val="1"/>
+      <w:numFmt w:val="bullet"/>
+      <w:lvlText w:val="○"/>
+      <w:lvlJc w:val="left"/>
+      <w:pPr>
+        <w:ind w:left="3600" w:hanging="360"/>
+      </w:pPr>
+      <w:rPr>
+        <w:u w:val="none"/>
+      </w:rPr>
+    </w:lvl>
+    <w:lvl w:ilvl="5">
+      <w:start w:val="1"/>
+      <w:numFmt w:val="bullet"/>
+      <w:lvlText w:val="■"/>
+      <w:lvlJc w:val="left"/>
+      <w:pPr>
+        <w:ind w:left="4320" w:hanging="360"/>
+      </w:pPr>
+      <w:rPr>
+        <w:u w:val="none"/>
+      </w:rPr>
+    </w:lvl>
+    <w:lvl w:ilvl="6">
+      <w:start w:val="1"/>
+      <w:numFmt w:val="bullet"/>
+      <w:lvlText w:val="●"/>
+      <w:lvlJc w:val="left"/>
+      <w:pPr>
+        <w:ind w:left="5040" w:hanging="360"/>
+      </w:pPr>
+      <w:rPr>
+        <w:u w:val="none"/>
+      </w:rPr>
+    </w:lvl>
+    <w:lvl w:ilvl="7">
+      <w:start w:val="1"/>
+      <w:numFmt w:val="bullet"/>
+      <w:lvlText w:val="○"/>
+      <w:lvlJc w:val="left"/>
+      <w:pPr>
+        <w:ind w:left="5760" w:hanging="360"/>
+      </w:pPr>
+      <w:rPr>
+        <w:u w:val="none"/>
+      </w:rPr>
+    </w:lvl>
+    <w:lvl w:ilvl="8">
+      <w:start w:val="1"/>
+      <w:numFmt w:val="bullet"/>
+      <w:lvlText w:val="■"/>
+      <w:lvlJc w:val="left"/>
+      <w:pPr>
+        <w:ind w:left="6480" w:hanging="360"/>
+      </w:pPr>
+      <w:rPr>
+        <w:u w:val="none"/>
+      </w:rPr>
+    </w:lvl>
+  </w:abstractNum>
+  <w:abstractNum w:abstractNumId="3">
+    <w:lvl w:ilvl="0">
+      <w:start w:val="1"/>
+      <w:numFmt w:val="decimal"/>
+      <w:lvlText w:val="%1."/>
+      <w:lvlJc w:val="left"/>
+      <w:pPr>
+        <w:ind w:left="720" w:hanging="360"/>
+      </w:pPr>
+      <w:rPr>
+        <w:u w:val="none"/>
+      </w:rPr>
+    </w:lvl>
+    <w:lvl w:ilvl="1">
+      <w:start w:val="1"/>
+      <w:numFmt w:val="lowerLetter"/>
+      <w:lvlText w:val="%2."/>
+      <w:lvlJc w:val="left"/>
+      <w:pPr>
+        <w:ind w:left="1440" w:hanging="360"/>
+      </w:pPr>
+      <w:rPr>
+        <w:u w:val="none"/>
+      </w:rPr>
+    </w:lvl>
+    <w:lvl w:ilvl="2">
+      <w:start w:val="1"/>
+      <w:numFmt w:val="lowerRoman"/>
+      <w:lvlText w:val="%3."/>
+      <w:lvlJc w:val="left"/>
+      <w:pPr>
+        <w:ind w:left="2160" w:hanging="360"/>
+      </w:pPr>
+      <w:rPr>
+        <w:u w:val="none"/>
+      </w:rPr>
+    </w:lvl>
+    <w:lvl w:ilvl="3">
+      <w:start w:val="1"/>
+      <w:numFmt w:val="decimal"/>
+      <w:lvlText w:val="%4."/>
+      <w:lvlJc w:val="left"/>
+      <w:pPr>
+        <w:ind w:left="2880" w:hanging="360"/>
+      </w:pPr>
+      <w:rPr>
+        <w:u w:val="none"/>
+      </w:rPr>
+    </w:lvl>
+    <w:lvl w:ilvl="4">
+      <w:start w:val="1"/>
+      <w:numFmt w:val="lowerLetter"/>
+      <w:lvlText w:val="%5."/>
+      <w:lvlJc w:val="left"/>
+      <w:pPr>
+        <w:ind w:left="3600" w:hanging="360"/>
+      </w:pPr>
+      <w:rPr>
+        <w:u w:val="none"/>
+      </w:rPr>
+    </w:lvl>
+    <w:lvl w:ilvl="5">
+      <w:start w:val="1"/>
+      <w:numFmt w:val="lowerRoman"/>
+      <w:lvlText w:val="%6."/>
+      <w:lvlJc w:val="left"/>
+      <w:pPr>
+        <w:ind w:left="4320" w:hanging="360"/>
+      </w:pPr>
+      <w:rPr>
+        <w:u w:val="none"/>
+      </w:rPr>
+    </w:lvl>
+    <w:lvl w:ilvl="6">
+      <w:start w:val="1"/>
+      <w:numFmt w:val="decimal"/>
+      <w:lvlText w:val="%7."/>
+      <w:lvlJc w:val="left"/>
+      <w:pPr>
+        <w:ind w:left="5040" w:hanging="360"/>
+      </w:pPr>
+      <w:rPr>
+        <w:u w:val="none"/>
+      </w:rPr>
+    </w:lvl>
+    <w:lvl w:ilvl="7">
+      <w:start w:val="1"/>
+      <w:numFmt w:val="lowerLetter"/>
+      <w:lvlText w:val="%8."/>
+      <w:lvlJc w:val="left"/>
+      <w:pPr>
+        <w:ind w:left="5760" w:hanging="360"/>
+      </w:pPr>
+      <w:rPr>
+        <w:u w:val="none"/>
+      </w:rPr>
+    </w:lvl>
+    <w:lvl w:ilvl="8">
+      <w:start w:val="1"/>
+      <w:numFmt w:val="lowerRoman"/>
+      <w:lvlText w:val="%9."/>
+      <w:lvlJc w:val="left"/>
+      <w:pPr>
+        <w:ind w:left="6480" w:hanging="360"/>
+      </w:pPr>
+      <w:rPr>
+        <w:u w:val="none"/>
+      </w:rPr>
+    </w:lvl>
+  </w:abstractNum>
+  <w:abstractNum w:abstractNumId="4">
+    <w:lvl w:ilvl="0">
+      <w:start w:val="1"/>
+      <w:numFmt w:val="bullet"/>
       <w:lvlText w:val="-"/>
       <w:lvlJc w:val="left"/>
       <w:pPr>
@@ -5139,7 +7317,7 @@
       </w:rPr>
     </w:lvl>
   </w:abstractNum>
-  <w:abstractNum w:abstractNumId="3">
+  <w:abstractNum w:abstractNumId="5">
     <w:lvl w:ilvl="0">
       <w:start w:val="1"/>
       <w:numFmt w:val="bullet"/>
@@ -5231,6 +7409,116 @@
         <w:ind w:left="0" w:firstLine="0"/>
       </w:pPr>
       <w:rPr/>
+    </w:lvl>
+  </w:abstractNum>
+  <w:abstractNum w:abstractNumId="6">
+    <w:lvl w:ilvl="0">
+      <w:start w:val="1"/>
+      <w:numFmt w:val="decimal"/>
+      <w:lvlText w:val="%1."/>
+      <w:lvlJc w:val="left"/>
+      <w:pPr>
+        <w:ind w:left="720" w:hanging="360"/>
+      </w:pPr>
+      <w:rPr>
+        <w:u w:val="none"/>
+      </w:rPr>
+    </w:lvl>
+    <w:lvl w:ilvl="1">
+      <w:start w:val="1"/>
+      <w:numFmt w:val="lowerLetter"/>
+      <w:lvlText w:val="%2."/>
+      <w:lvlJc w:val="left"/>
+      <w:pPr>
+        <w:ind w:left="1440" w:hanging="360"/>
+      </w:pPr>
+      <w:rPr>
+        <w:u w:val="none"/>
+      </w:rPr>
+    </w:lvl>
+    <w:lvl w:ilvl="2">
+      <w:start w:val="1"/>
+      <w:numFmt w:val="lowerRoman"/>
+      <w:lvlText w:val="%3."/>
+      <w:lvlJc w:val="left"/>
+      <w:pPr>
+        <w:ind w:left="2160" w:hanging="360"/>
+      </w:pPr>
+      <w:rPr>
+        <w:u w:val="none"/>
+      </w:rPr>
+    </w:lvl>
+    <w:lvl w:ilvl="3">
+      <w:start w:val="1"/>
+      <w:numFmt w:val="decimal"/>
+      <w:lvlText w:val="%4."/>
+      <w:lvlJc w:val="left"/>
+      <w:pPr>
+        <w:ind w:left="2880" w:hanging="360"/>
+      </w:pPr>
+      <w:rPr>
+        <w:u w:val="none"/>
+      </w:rPr>
+    </w:lvl>
+    <w:lvl w:ilvl="4">
+      <w:start w:val="1"/>
+      <w:numFmt w:val="lowerLetter"/>
+      <w:lvlText w:val="%5."/>
+      <w:lvlJc w:val="left"/>
+      <w:pPr>
+        <w:ind w:left="3600" w:hanging="360"/>
+      </w:pPr>
+      <w:rPr>
+        <w:u w:val="none"/>
+      </w:rPr>
+    </w:lvl>
+    <w:lvl w:ilvl="5">
+      <w:start w:val="1"/>
+      <w:numFmt w:val="lowerRoman"/>
+      <w:lvlText w:val="%6."/>
+      <w:lvlJc w:val="left"/>
+      <w:pPr>
+        <w:ind w:left="4320" w:hanging="360"/>
+      </w:pPr>
+      <w:rPr>
+        <w:u w:val="none"/>
+      </w:rPr>
+    </w:lvl>
+    <w:lvl w:ilvl="6">
+      <w:start w:val="1"/>
+      <w:numFmt w:val="decimal"/>
+      <w:lvlText w:val="%7."/>
+      <w:lvlJc w:val="left"/>
+      <w:pPr>
+        <w:ind w:left="5040" w:hanging="360"/>
+      </w:pPr>
+      <w:rPr>
+        <w:u w:val="none"/>
+      </w:rPr>
+    </w:lvl>
+    <w:lvl w:ilvl="7">
+      <w:start w:val="1"/>
+      <w:numFmt w:val="lowerLetter"/>
+      <w:lvlText w:val="%8."/>
+      <w:lvlJc w:val="left"/>
+      <w:pPr>
+        <w:ind w:left="5760" w:hanging="360"/>
+      </w:pPr>
+      <w:rPr>
+        <w:u w:val="none"/>
+      </w:rPr>
+    </w:lvl>
+    <w:lvl w:ilvl="8">
+      <w:start w:val="1"/>
+      <w:numFmt w:val="lowerRoman"/>
+      <w:lvlText w:val="%9."/>
+      <w:lvlJc w:val="left"/>
+      <w:pPr>
+        <w:ind w:left="6480" w:hanging="360"/>
+      </w:pPr>
+      <w:rPr>
+        <w:u w:val="none"/>
+      </w:rPr>
     </w:lvl>
   </w:abstractNum>
   <w:num w:numId="1">
@@ -5241,6 +7529,15 @@
   </w:num>
   <w:num w:numId="3">
     <w:abstractNumId w:val="3"/>
+  </w:num>
+  <w:num w:numId="4">
+    <w:abstractNumId w:val="4"/>
+  </w:num>
+  <w:num w:numId="5">
+    <w:abstractNumId w:val="5"/>
+  </w:num>
+  <w:num w:numId="6">
+    <w:abstractNumId w:val="6"/>
   </w:num>
 </w:numbering>
 </file>
@@ -16261,6 +18558,22 @@
       <w:szCs w:val="24"/>
     </w:rPr>
   </w:style>
+  <w:style w:type="table" w:styleId="Table1">
+    <w:basedOn w:val="TableNormal"/>
+    <w:tblPr>
+      <w:tblStyleRowBandSize w:val="1"/>
+      <w:tblStyleColBandSize w:val="1"/>
+      <w:tblCellMar/>
+    </w:tblPr>
+  </w:style>
+  <w:style w:type="table" w:styleId="Table2">
+    <w:basedOn w:val="TableNormal"/>
+    <w:tblPr>
+      <w:tblStyleRowBandSize w:val="1"/>
+      <w:tblStyleColBandSize w:val="1"/>
+      <w:tblCellMar/>
+    </w:tblPr>
+  </w:style>
 </w:styles>
 </file>
 
@@ -16586,7 +18899,7 @@
 
 <file path=customXML/item1.xml><?xml version="1.0" encoding="utf-8"?>
 <go:gDocsCustomXmlDataStorage xmlns:go="http://customooxmlschemas.google.com/" xmlns:r="http://schemas.openxmlformats.org/officeDocument/2006/relationships" uri="GoogleDocsCustomDataVersion2">
-  <go:docsCustomData xmlns:go="http://customooxmlschemas.google.com/" roundtripDataSignature="AMtx7mjnTFXRIQ3S3SkMLihx0f2Kjpf3rA==">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</go:docsCustomData>
+  <go:docsCustomData xmlns:go="http://customooxmlschemas.google.com/" roundtripDataSignature="AMtx7mgo1hEXiMjC00W0F4Rj3N5Px0PyoA==">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</go:docsCustomData>
 </go:gDocsCustomXmlDataStorage>
 </file>
 

</xml_diff>